<commit_message>
Manual de Vista 3D rev. 4: novedades, guardar/cargar y mensajes nuevos
- Sección 0 con las novedades del 24-sep-2026 y qué hacer después de
  actualizar (recalcular POA y sombra, rehacer el bypass, volver a publicar).
- POA no vigente en vista 3D, producción y trayectoria solar; confirmación al
  adoptar el físico; panel usado en el MPPT; N serie/paralelo como fuente
  única.
- Nueva sección 8: qué se guarda con el proyecto y cómo se restaura.
- Tabla de mensajes con los avisos nuevos. Word regenerado.
- Asistente: guardar y cargar un proyecto multi-superficie, con prueba de
  recuperación.

Co-Authored-By: Claude Opus 5.5 <noreply@anthropic.com>
Claude-Session: https://claude.ai/code/session_01J652KVwAx7nCc91Dn42CnM
</commit_message>
<xml_diff>
--- a/entregables/MANUAL_VISTA_3D_BIPV.docx
+++ b/entregables/MANUAL_VISTA_3D_BIPV.docx
@@ -21,7 +21,7 @@
         <w:rPr>
           <w:rFonts w:ascii="Calibri" w:cs="Calibri" w:eastAsia="Calibri" w:hAnsi="Calibri"/>
         </w:rPr>
-        <w:t xml:space="preserve">Versión: 24-sep-2026 (rev. 3) · Código de referencia: rama </w:t>
+        <w:t xml:space="preserve">Versión: 24-sep-2026 (rev. 4) · Código de referencia: </w:t>
       </w:r>
       <w:r>
         <w:rPr>
@@ -30,13 +30,28 @@
           <w:szCs w:val="20"/>
           <w:shd w:fill="F1F3F5" w:color="auto" w:val="clear"/>
         </w:rPr>
-        <w:t xml:space="preserve">claude/mejoras-bipv</w:t>
-      </w:r>
-      <w:r>
-        <w:rPr>
-          <w:rFonts w:ascii="Calibri" w:cs="Calibri" w:eastAsia="Calibri" w:hAnsi="Calibri"/>
-        </w:rPr>
-        <w:t xml:space="preserve"> (incluye la corrección de sombra con el sol detrás del módulo, algoritmo v2, la corrección del mapa de calor POA, la vigencia de la POA por superficie, la publicación única de la energía multi-superficie, la validación de puntos 3D, el estado de sombra por superficie y el panel del proyecto en bypass y MPPT).</w:t>
+        <w:t xml:space="preserve">main</w:t>
+      </w:r>
+      <w:r>
+        <w:rPr>
+          <w:rFonts w:ascii="Calibri" w:cs="Calibri" w:eastAsia="Calibri" w:hAnsi="Calibri"/>
+        </w:rPr>
+        <w:t xml:space="preserve"> </w:t>
+      </w:r>
+      <w:r>
+        <w:rPr>
+          <w:rFonts w:ascii="Consolas" w:cs="Consolas" w:eastAsia="Consolas" w:hAnsi="Consolas"/>
+          <w:sz w:val="20"/>
+          <w:szCs w:val="20"/>
+          <w:shd w:fill="F1F3F5" w:color="auto" w:val="clear"/>
+        </w:rPr>
+        <w:t xml:space="preserve">72326f2f</w:t>
+      </w:r>
+      <w:r>
+        <w:rPr>
+          <w:rFonts w:ascii="Calibri" w:cs="Calibri" w:eastAsia="Calibri" w:hAnsi="Calibri"/>
+        </w:rPr>
+        <w:t xml:space="preserve"> (desplegado el 24-sep-2026).</w:t>
       </w:r>
     </w:p>
     <w:p>
@@ -69,6 +84,1023 @@
         </w:p>
       </w:sdtContent>
     </w:sdt>
+    <w:p>
+      <w:pPr>
+        <w:pStyle w:val="Heading1"/>
+      </w:pPr>
+      <w:r>
+        <w:rPr>
+          <w:rFonts w:ascii="Calibri" w:cs="Calibri" w:eastAsia="Calibri" w:hAnsi="Calibri"/>
+        </w:rPr>
+        <w:t xml:space="preserve">0. Novedades de esta versión (24-sep-2026)</w:t>
+      </w:r>
+    </w:p>
+    <w:tbl>
+      <w:tblPr>
+        <w:tblW w:type="dxa" w:w="9026"/>
+        <w:tblBorders>
+          <w:top w:val="single" w:color="auto" w:sz="4"/>
+          <w:left w:val="single" w:color="auto" w:sz="4"/>
+          <w:bottom w:val="single" w:color="auto" w:sz="4"/>
+          <w:right w:val="single" w:color="auto" w:sz="4"/>
+          <w:insideH w:val="single" w:color="auto" w:sz="4"/>
+          <w:insideV w:val="single" w:color="auto" w:sz="4"/>
+        </w:tblBorders>
+      </w:tblPr>
+      <w:tblGrid>
+        <w:gridCol w:w="1100"/>
+        <w:gridCol w:w="5473"/>
+        <w:gridCol w:w="2453"/>
+      </w:tblGrid>
+      <w:tr>
+        <w:trPr>
+          <w:tblHeader/>
+        </w:trPr>
+        <w:tc>
+          <w:tcPr>
+            <w:tcW w:type="dxa" w:w="1100"/>
+            <w:tcBorders>
+              <w:top w:val="single" w:color="BFC5CC" w:sz="4"/>
+              <w:left w:val="single" w:color="BFC5CC" w:sz="4"/>
+              <w:bottom w:val="single" w:color="BFC5CC" w:sz="4"/>
+              <w:right w:val="single" w:color="BFC5CC" w:sz="4"/>
+            </w:tcBorders>
+            <w:shd w:fill="1F4E79" w:color="auto" w:val="clear"/>
+            <w:tcMar>
+              <w:top w:type="dxa" w:w="60"/>
+              <w:left w:type="dxa" w:w="100"/>
+              <w:bottom w:type="dxa" w:w="60"/>
+              <w:right w:type="dxa" w:w="100"/>
+            </w:tcMar>
+          </w:tcPr>
+          <w:p>
+            <w:r>
+              <w:rPr>
+                <w:rFonts w:ascii="Calibri" w:cs="Calibri" w:eastAsia="Calibri" w:hAnsi="Calibri"/>
+                <w:b/>
+                <w:bCs/>
+                <w:color w:val="FFFFFF"/>
+                <w:sz w:val="20"/>
+                <w:szCs w:val="20"/>
+              </w:rPr>
+              <w:t xml:space="preserve">Cambio</w:t>
+            </w:r>
+          </w:p>
+        </w:tc>
+        <w:tc>
+          <w:tcPr>
+            <w:tcW w:type="dxa" w:w="5473"/>
+            <w:tcBorders>
+              <w:top w:val="single" w:color="BFC5CC" w:sz="4"/>
+              <w:left w:val="single" w:color="BFC5CC" w:sz="4"/>
+              <w:bottom w:val="single" w:color="BFC5CC" w:sz="4"/>
+              <w:right w:val="single" w:color="BFC5CC" w:sz="4"/>
+            </w:tcBorders>
+            <w:shd w:fill="1F4E79" w:color="auto" w:val="clear"/>
+            <w:tcMar>
+              <w:top w:type="dxa" w:w="60"/>
+              <w:left w:type="dxa" w:w="100"/>
+              <w:bottom w:type="dxa" w:w="60"/>
+              <w:right w:type="dxa" w:w="100"/>
+            </w:tcMar>
+          </w:tcPr>
+          <w:p>
+            <w:r>
+              <w:rPr>
+                <w:rFonts w:ascii="Calibri" w:cs="Calibri" w:eastAsia="Calibri" w:hAnsi="Calibri"/>
+                <w:b/>
+                <w:bCs/>
+                <w:color w:val="FFFFFF"/>
+                <w:sz w:val="20"/>
+                <w:szCs w:val="20"/>
+              </w:rPr>
+              <w:t xml:space="preserve">Qué ves ahora</w:t>
+            </w:r>
+          </w:p>
+        </w:tc>
+        <w:tc>
+          <w:tcPr>
+            <w:tcW w:type="dxa" w:w="2453"/>
+            <w:tcBorders>
+              <w:top w:val="single" w:color="BFC5CC" w:sz="4"/>
+              <w:left w:val="single" w:color="BFC5CC" w:sz="4"/>
+              <w:bottom w:val="single" w:color="BFC5CC" w:sz="4"/>
+              <w:right w:val="single" w:color="BFC5CC" w:sz="4"/>
+            </w:tcBorders>
+            <w:shd w:fill="1F4E79" w:color="auto" w:val="clear"/>
+            <w:tcMar>
+              <w:top w:type="dxa" w:w="60"/>
+              <w:left w:type="dxa" w:w="100"/>
+              <w:bottom w:type="dxa" w:w="60"/>
+              <w:right w:type="dxa" w:w="100"/>
+            </w:tcMar>
+          </w:tcPr>
+          <w:p>
+            <w:r>
+              <w:rPr>
+                <w:rFonts w:ascii="Calibri" w:cs="Calibri" w:eastAsia="Calibri" w:hAnsi="Calibri"/>
+                <w:b/>
+                <w:bCs/>
+                <w:color w:val="FFFFFF"/>
+                <w:sz w:val="20"/>
+                <w:szCs w:val="20"/>
+              </w:rPr>
+              <w:t xml:space="preserve">Antes</w:t>
+            </w:r>
+          </w:p>
+        </w:tc>
+      </w:tr>
+      <w:tr>
+        <w:trPr>
+          <w:tblHeader w:val="false"/>
+        </w:trPr>
+        <w:tc>
+          <w:tcPr>
+            <w:tcW w:type="dxa" w:w="1100"/>
+            <w:tcBorders>
+              <w:top w:val="single" w:color="BFC5CC" w:sz="4"/>
+              <w:left w:val="single" w:color="BFC5CC" w:sz="4"/>
+              <w:bottom w:val="single" w:color="BFC5CC" w:sz="4"/>
+              <w:right w:val="single" w:color="BFC5CC" w:sz="4"/>
+            </w:tcBorders>
+            <w:tcMar>
+              <w:top w:type="dxa" w:w="60"/>
+              <w:left w:type="dxa" w:w="100"/>
+              <w:bottom w:type="dxa" w:w="60"/>
+              <w:right w:type="dxa" w:w="100"/>
+            </w:tcMar>
+          </w:tcPr>
+          <w:p>
+            <w:r>
+              <w:rPr>
+                <w:rFonts w:ascii="Calibri" w:cs="Calibri" w:eastAsia="Calibri" w:hAnsi="Calibri"/>
+                <w:b/>
+                <w:bCs/>
+                <w:sz w:val="20"/>
+                <w:szCs w:val="20"/>
+              </w:rPr>
+              <w:t xml:space="preserve">Vigencia de la POA</w:t>
+            </w:r>
+          </w:p>
+        </w:tc>
+        <w:tc>
+          <w:tcPr>
+            <w:tcW w:type="dxa" w:w="5473"/>
+            <w:tcBorders>
+              <w:top w:val="single" w:color="BFC5CC" w:sz="4"/>
+              <w:left w:val="single" w:color="BFC5CC" w:sz="4"/>
+              <w:bottom w:val="single" w:color="BFC5CC" w:sz="4"/>
+              <w:right w:val="single" w:color="BFC5CC" w:sz="4"/>
+            </w:tcBorders>
+            <w:tcMar>
+              <w:top w:type="dxa" w:w="60"/>
+              <w:left w:type="dxa" w:w="100"/>
+              <w:bottom w:type="dxa" w:w="60"/>
+              <w:right w:type="dxa" w:w="100"/>
+            </w:tcMar>
+          </w:tcPr>
+          <w:p>
+            <w:r>
+              <w:rPr>
+                <w:rFonts w:ascii="Calibri" w:cs="Calibri" w:eastAsia="Calibri" w:hAnsi="Calibri"/>
+                <w:sz w:val="20"/>
+                <w:szCs w:val="20"/>
+              </w:rPr>
+              <w:t xml:space="preserve">Si cambias la geometría, el montaje, el albedo, el bifacial, el TMY o la ubicación, la superficie sale en </w:t>
+            </w:r>
+            <w:r>
+              <w:rPr>
+                <w:rFonts w:ascii="Calibri" w:cs="Calibri" w:eastAsia="Calibri" w:hAnsi="Calibri"/>
+                <w:b/>
+                <w:bCs/>
+                <w:sz w:val="20"/>
+                <w:szCs w:val="20"/>
+              </w:rPr>
+              <w:t xml:space="preserve">⚠️ Estas superficies no tienen POA vigente…</w:t>
+            </w:r>
+            <w:r>
+              <w:rPr>
+                <w:rFonts w:ascii="Calibri" w:cs="Calibri" w:eastAsia="Calibri" w:hAnsi="Calibri"/>
+                <w:sz w:val="20"/>
+                <w:szCs w:val="20"/>
+              </w:rPr>
+              <w:t xml:space="preserve"> y no se usa hasta recalcular</w:t>
+            </w:r>
+          </w:p>
+        </w:tc>
+        <w:tc>
+          <w:tcPr>
+            <w:tcW w:type="dxa" w:w="2453"/>
+            <w:tcBorders>
+              <w:top w:val="single" w:color="BFC5CC" w:sz="4"/>
+              <w:left w:val="single" w:color="BFC5CC" w:sz="4"/>
+              <w:bottom w:val="single" w:color="BFC5CC" w:sz="4"/>
+              <w:right w:val="single" w:color="BFC5CC" w:sz="4"/>
+            </w:tcBorders>
+            <w:tcMar>
+              <w:top w:type="dxa" w:w="60"/>
+              <w:left w:type="dxa" w:w="100"/>
+              <w:bottom w:type="dxa" w:w="60"/>
+              <w:right w:type="dxa" w:w="100"/>
+            </w:tcMar>
+          </w:tcPr>
+          <w:p>
+            <w:r>
+              <w:rPr>
+                <w:rFonts w:ascii="Calibri" w:cs="Calibri" w:eastAsia="Calibri" w:hAnsi="Calibri"/>
+                <w:sz w:val="20"/>
+                <w:szCs w:val="20"/>
+              </w:rPr>
+              <w:t xml:space="preserve">Se seguía usando la POA de la geometría anterior sin aviso</w:t>
+            </w:r>
+          </w:p>
+        </w:tc>
+      </w:tr>
+      <w:tr>
+        <w:trPr>
+          <w:tblHeader w:val="false"/>
+        </w:trPr>
+        <w:tc>
+          <w:tcPr>
+            <w:tcW w:type="dxa" w:w="1100"/>
+            <w:tcBorders>
+              <w:top w:val="single" w:color="BFC5CC" w:sz="4"/>
+              <w:left w:val="single" w:color="BFC5CC" w:sz="4"/>
+              <w:bottom w:val="single" w:color="BFC5CC" w:sz="4"/>
+              <w:right w:val="single" w:color="BFC5CC" w:sz="4"/>
+            </w:tcBorders>
+            <w:tcMar>
+              <w:top w:type="dxa" w:w="60"/>
+              <w:left w:type="dxa" w:w="100"/>
+              <w:bottom w:type="dxa" w:w="60"/>
+              <w:right w:type="dxa" w:w="100"/>
+            </w:tcMar>
+          </w:tcPr>
+          <w:p>
+            <w:r>
+              <w:rPr>
+                <w:rFonts w:ascii="Calibri" w:cs="Calibri" w:eastAsia="Calibri" w:hAnsi="Calibri"/>
+                <w:b/>
+                <w:bCs/>
+                <w:sz w:val="20"/>
+                <w:szCs w:val="20"/>
+              </w:rPr>
+              <w:t xml:space="preserve">Publicación única de la energía</w:t>
+            </w:r>
+          </w:p>
+        </w:tc>
+        <w:tc>
+          <w:tcPr>
+            <w:tcW w:type="dxa" w:w="5473"/>
+            <w:tcBorders>
+              <w:top w:val="single" w:color="BFC5CC" w:sz="4"/>
+              <w:left w:val="single" w:color="BFC5CC" w:sz="4"/>
+              <w:bottom w:val="single" w:color="BFC5CC" w:sz="4"/>
+              <w:right w:val="single" w:color="BFC5CC" w:sz="4"/>
+            </w:tcBorders>
+            <w:tcMar>
+              <w:top w:type="dxa" w:w="60"/>
+              <w:left w:type="dxa" w:w="100"/>
+              <w:bottom w:type="dxa" w:w="60"/>
+              <w:right w:type="dxa" w:w="100"/>
+            </w:tcMar>
+          </w:tcPr>
+          <w:p>
+            <w:r>
+              <w:rPr>
+                <w:rFonts w:ascii="Calibri" w:cs="Calibri" w:eastAsia="Calibri" w:hAnsi="Calibri"/>
+                <w:sz w:val="20"/>
+                <w:szCs w:val="20"/>
+              </w:rPr>
+              <w:t xml:space="preserve">Los tres botones publican juntos total, desglose, área y POA con su </w:t>
+            </w:r>
+            <w:r>
+              <w:rPr>
+                <w:rFonts w:ascii="Calibri" w:cs="Calibri" w:eastAsia="Calibri" w:hAnsi="Calibri"/>
+                <w:b/>
+                <w:bCs/>
+                <w:sz w:val="20"/>
+                <w:szCs w:val="20"/>
+              </w:rPr>
+              <w:t xml:space="preserve">origen</w:t>
+            </w:r>
+            <w:r>
+              <w:rPr>
+                <w:rFonts w:ascii="Calibri" w:cs="Calibri" w:eastAsia="Calibri" w:hAnsi="Calibri"/>
+                <w:sz w:val="20"/>
+                <w:szCs w:val="20"/>
+              </w:rPr>
+              <w:t xml:space="preserve">; reemplazar otro origen pide </w:t>
+            </w:r>
+            <w:r>
+              <w:rPr>
+                <w:rFonts w:ascii="Calibri" w:cs="Calibri" w:eastAsia="Calibri" w:hAnsi="Calibri"/>
+                <w:b/>
+                <w:bCs/>
+                <w:sz w:val="20"/>
+                <w:szCs w:val="20"/>
+              </w:rPr>
+              <w:t xml:space="preserve">confirmación</w:t>
+            </w:r>
+          </w:p>
+        </w:tc>
+        <w:tc>
+          <w:tcPr>
+            <w:tcW w:type="dxa" w:w="2453"/>
+            <w:tcBorders>
+              <w:top w:val="single" w:color="BFC5CC" w:sz="4"/>
+              <w:left w:val="single" w:color="BFC5CC" w:sz="4"/>
+              <w:bottom w:val="single" w:color="BFC5CC" w:sz="4"/>
+              <w:right w:val="single" w:color="BFC5CC" w:sz="4"/>
+            </w:tcBorders>
+            <w:tcMar>
+              <w:top w:type="dxa" w:w="60"/>
+              <w:left w:type="dxa" w:w="100"/>
+              <w:bottom w:type="dxa" w:w="60"/>
+              <w:right w:type="dxa" w:w="100"/>
+            </w:tcMar>
+          </w:tcPr>
+          <w:p>
+            <w:r>
+              <w:rPr>
+                <w:rFonts w:ascii="Calibri" w:cs="Calibri" w:eastAsia="Calibri" w:hAnsi="Calibri"/>
+                <w:sz w:val="20"/>
+                <w:szCs w:val="20"/>
+              </w:rPr>
+              <w:t xml:space="preserve">«Ganaba el último botón» y el bypass cambiaba solo el total</w:t>
+            </w:r>
+          </w:p>
+        </w:tc>
+      </w:tr>
+      <w:tr>
+        <w:trPr>
+          <w:tblHeader w:val="false"/>
+        </w:trPr>
+        <w:tc>
+          <w:tcPr>
+            <w:tcW w:type="dxa" w:w="1100"/>
+            <w:tcBorders>
+              <w:top w:val="single" w:color="BFC5CC" w:sz="4"/>
+              <w:left w:val="single" w:color="BFC5CC" w:sz="4"/>
+              <w:bottom w:val="single" w:color="BFC5CC" w:sz="4"/>
+              <w:right w:val="single" w:color="BFC5CC" w:sz="4"/>
+            </w:tcBorders>
+            <w:tcMar>
+              <w:top w:type="dxa" w:w="60"/>
+              <w:left w:type="dxa" w:w="100"/>
+              <w:bottom w:type="dxa" w:w="60"/>
+              <w:right w:type="dxa" w:w="100"/>
+            </w:tcMar>
+          </w:tcPr>
+          <w:p>
+            <w:r>
+              <w:rPr>
+                <w:rFonts w:ascii="Calibri" w:cs="Calibri" w:eastAsia="Calibri" w:hAnsi="Calibri"/>
+                <w:b/>
+                <w:bCs/>
+                <w:sz w:val="20"/>
+                <w:szCs w:val="20"/>
+              </w:rPr>
+              <w:t xml:space="preserve">Puntos 3D</w:t>
+            </w:r>
+          </w:p>
+        </w:tc>
+        <w:tc>
+          <w:tcPr>
+            <w:tcW w:type="dxa" w:w="5473"/>
+            <w:tcBorders>
+              <w:top w:val="single" w:color="BFC5CC" w:sz="4"/>
+              <w:left w:val="single" w:color="BFC5CC" w:sz="4"/>
+              <w:bottom w:val="single" w:color="BFC5CC" w:sz="4"/>
+              <w:right w:val="single" w:color="BFC5CC" w:sz="4"/>
+            </w:tcBorders>
+            <w:tcMar>
+              <w:top w:type="dxa" w:w="60"/>
+              <w:left w:type="dxa" w:w="100"/>
+              <w:bottom w:type="dxa" w:w="60"/>
+              <w:right w:type="dxa" w:w="100"/>
+            </w:tcMar>
+          </w:tcPr>
+          <w:p>
+            <w:r>
+              <w:rPr>
+                <w:rFonts w:ascii="Calibri" w:cs="Calibri" w:eastAsia="Calibri" w:hAnsi="Calibri"/>
+                <w:sz w:val="20"/>
+                <w:szCs w:val="20"/>
+              </w:rPr>
+              <w:t xml:space="preserve">Acepta </w:t>
+            </w:r>
+            <w:r>
+              <w:rPr>
+                <w:rFonts w:ascii="Consolas" w:cs="Consolas" w:eastAsia="Consolas" w:hAnsi="Consolas"/>
+                <w:sz w:val="20"/>
+                <w:szCs w:val="20"/>
+                <w:shd w:fill="F1F3F5" w:color="auto" w:val="clear"/>
+              </w:rPr>
+              <w:t xml:space="preserve">x,y,z</w:t>
+            </w:r>
+            <w:r>
+              <w:rPr>
+                <w:rFonts w:ascii="Calibri" w:cs="Calibri" w:eastAsia="Calibri" w:hAnsi="Calibri"/>
+                <w:sz w:val="20"/>
+                <w:szCs w:val="20"/>
+              </w:rPr>
+              <w:t xml:space="preserve"> y </w:t>
+            </w:r>
+            <w:r>
+              <w:rPr>
+                <w:rFonts w:ascii="Consolas" w:cs="Consolas" w:eastAsia="Consolas" w:hAnsi="Consolas"/>
+                <w:sz w:val="20"/>
+                <w:szCs w:val="20"/>
+                <w:shd w:fill="F1F3F5" w:color="auto" w:val="clear"/>
+              </w:rPr>
+              <w:t xml:space="preserve">x;y;z</w:t>
+            </w:r>
+            <w:r>
+              <w:rPr>
+                <w:rFonts w:ascii="Calibri" w:cs="Calibri" w:eastAsia="Calibri" w:hAnsi="Calibri"/>
+                <w:sz w:val="20"/>
+                <w:szCs w:val="20"/>
+              </w:rPr>
+              <w:t xml:space="preserve"> (coma decimal); una línea mal escrita sale en rojo y bloquea el cálculo; aviso de punto dentro del volumen antes de calcular</w:t>
+            </w:r>
+          </w:p>
+        </w:tc>
+        <w:tc>
+          <w:tcPr>
+            <w:tcW w:type="dxa" w:w="2453"/>
+            <w:tcBorders>
+              <w:top w:val="single" w:color="BFC5CC" w:sz="4"/>
+              <w:left w:val="single" w:color="BFC5CC" w:sz="4"/>
+              <w:bottom w:val="single" w:color="BFC5CC" w:sz="4"/>
+              <w:right w:val="single" w:color="BFC5CC" w:sz="4"/>
+            </w:tcBorders>
+            <w:tcMar>
+              <w:top w:type="dxa" w:w="60"/>
+              <w:left w:type="dxa" w:w="100"/>
+              <w:bottom w:type="dxa" w:w="60"/>
+              <w:right w:type="dxa" w:w="100"/>
+            </w:tcMar>
+          </w:tcPr>
+          <w:p>
+            <w:r>
+              <w:rPr>
+                <w:rFonts w:ascii="Calibri" w:cs="Calibri" w:eastAsia="Calibri" w:hAnsi="Calibri"/>
+                <w:sz w:val="20"/>
+                <w:szCs w:val="20"/>
+              </w:rPr>
+              <w:t xml:space="preserve">Las líneas mal escritas se perdían en silencio</w:t>
+            </w:r>
+          </w:p>
+        </w:tc>
+      </w:tr>
+      <w:tr>
+        <w:trPr>
+          <w:tblHeader w:val="false"/>
+        </w:trPr>
+        <w:tc>
+          <w:tcPr>
+            <w:tcW w:type="dxa" w:w="1100"/>
+            <w:tcBorders>
+              <w:top w:val="single" w:color="BFC5CC" w:sz="4"/>
+              <w:left w:val="single" w:color="BFC5CC" w:sz="4"/>
+              <w:bottom w:val="single" w:color="BFC5CC" w:sz="4"/>
+              <w:right w:val="single" w:color="BFC5CC" w:sz="4"/>
+            </w:tcBorders>
+            <w:tcMar>
+              <w:top w:type="dxa" w:w="60"/>
+              <w:left w:type="dxa" w:w="100"/>
+              <w:bottom w:type="dxa" w:w="60"/>
+              <w:right w:type="dxa" w:w="100"/>
+            </w:tcMar>
+          </w:tcPr>
+          <w:p>
+            <w:r>
+              <w:rPr>
+                <w:rFonts w:ascii="Calibri" w:cs="Calibri" w:eastAsia="Calibri" w:hAnsi="Calibri"/>
+                <w:b/>
+                <w:bCs/>
+                <w:sz w:val="20"/>
+                <w:szCs w:val="20"/>
+              </w:rPr>
+              <w:t xml:space="preserve">Estado de la sombra</w:t>
+            </w:r>
+          </w:p>
+        </w:tc>
+        <w:tc>
+          <w:tcPr>
+            <w:tcW w:type="dxa" w:w="5473"/>
+            <w:tcBorders>
+              <w:top w:val="single" w:color="BFC5CC" w:sz="4"/>
+              <w:left w:val="single" w:color="BFC5CC" w:sz="4"/>
+              <w:bottom w:val="single" w:color="BFC5CC" w:sz="4"/>
+              <w:right w:val="single" w:color="BFC5CC" w:sz="4"/>
+            </w:tcBorders>
+            <w:tcMar>
+              <w:top w:type="dxa" w:w="60"/>
+              <w:left w:type="dxa" w:w="100"/>
+              <w:bottom w:type="dxa" w:w="60"/>
+              <w:right w:type="dxa" w:w="100"/>
+            </w:tcMar>
+          </w:tcPr>
+          <w:p>
+            <w:r>
+              <w:rPr>
+                <w:rFonts w:ascii="Calibri" w:cs="Calibri" w:eastAsia="Calibri" w:hAnsi="Calibri"/>
+                <w:sz w:val="20"/>
+                <w:szCs w:val="20"/>
+              </w:rPr>
+              <w:t xml:space="preserve">Tabla </w:t>
+            </w:r>
+            <w:r>
+              <w:rPr>
+                <w:rFonts w:ascii="Calibri" w:cs="Calibri" w:eastAsia="Calibri" w:hAnsi="Calibri"/>
+                <w:b/>
+                <w:bCs/>
+                <w:sz w:val="20"/>
+                <w:szCs w:val="20"/>
+              </w:rPr>
+              <w:t xml:space="preserve">Estado de la sombra por superficie</w:t>
+            </w:r>
+            <w:r>
+              <w:rPr>
+                <w:rFonts w:ascii="Calibri" w:cs="Calibri" w:eastAsia="Calibri" w:hAnsi="Calibri"/>
+                <w:sz w:val="20"/>
+                <w:szCs w:val="20"/>
+              </w:rPr>
+              <w:t xml:space="preserve"> con 🟢/🔴/⚪, motivo y qué hacer</w:t>
+            </w:r>
+          </w:p>
+        </w:tc>
+        <w:tc>
+          <w:tcPr>
+            <w:tcW w:type="dxa" w:w="2453"/>
+            <w:tcBorders>
+              <w:top w:val="single" w:color="BFC5CC" w:sz="4"/>
+              <w:left w:val="single" w:color="BFC5CC" w:sz="4"/>
+              <w:bottom w:val="single" w:color="BFC5CC" w:sz="4"/>
+              <w:right w:val="single" w:color="BFC5CC" w:sz="4"/>
+            </w:tcBorders>
+            <w:tcMar>
+              <w:top w:type="dxa" w:w="60"/>
+              <w:left w:type="dxa" w:w="100"/>
+              <w:bottom w:type="dxa" w:w="60"/>
+              <w:right w:type="dxa" w:w="100"/>
+            </w:tcMar>
+          </w:tcPr>
+          <w:p>
+            <w:r>
+              <w:rPr>
+                <w:rFonts w:ascii="Calibri" w:cs="Calibri" w:eastAsia="Calibri" w:hAnsi="Calibri"/>
+                <w:sz w:val="20"/>
+                <w:szCs w:val="20"/>
+              </w:rPr>
+              <w:t xml:space="preserve">No se veía; además el resultado de «🌳 Calcular sombra» </w:t>
+            </w:r>
+            <w:r>
+              <w:rPr>
+                <w:rFonts w:ascii="Calibri" w:cs="Calibri" w:eastAsia="Calibri" w:hAnsi="Calibri"/>
+                <w:b/>
+                <w:bCs/>
+                <w:sz w:val="20"/>
+                <w:szCs w:val="20"/>
+              </w:rPr>
+              <w:t xml:space="preserve">se perdía</w:t>
+            </w:r>
+            <w:r>
+              <w:rPr>
+                <w:rFonts w:ascii="Calibri" w:cs="Calibri" w:eastAsia="Calibri" w:hAnsi="Calibri"/>
+                <w:sz w:val="20"/>
+                <w:szCs w:val="20"/>
+              </w:rPr>
+              <w:t xml:space="preserve"> al calcular</w:t>
+            </w:r>
+          </w:p>
+        </w:tc>
+      </w:tr>
+      <w:tr>
+        <w:trPr>
+          <w:tblHeader w:val="false"/>
+        </w:trPr>
+        <w:tc>
+          <w:tcPr>
+            <w:tcW w:type="dxa" w:w="1100"/>
+            <w:tcBorders>
+              <w:top w:val="single" w:color="BFC5CC" w:sz="4"/>
+              <w:left w:val="single" w:color="BFC5CC" w:sz="4"/>
+              <w:bottom w:val="single" w:color="BFC5CC" w:sz="4"/>
+              <w:right w:val="single" w:color="BFC5CC" w:sz="4"/>
+            </w:tcBorders>
+            <w:tcMar>
+              <w:top w:type="dxa" w:w="60"/>
+              <w:left w:type="dxa" w:w="100"/>
+              <w:bottom w:type="dxa" w:w="60"/>
+              <w:right w:type="dxa" w:w="100"/>
+            </w:tcMar>
+          </w:tcPr>
+          <w:p>
+            <w:r>
+              <w:rPr>
+                <w:rFonts w:ascii="Calibri" w:cs="Calibri" w:eastAsia="Calibri" w:hAnsi="Calibri"/>
+                <w:b/>
+                <w:bCs/>
+                <w:sz w:val="20"/>
+                <w:szCs w:val="20"/>
+              </w:rPr>
+              <w:t xml:space="preserve">Panel y strings del proyecto</w:t>
+            </w:r>
+          </w:p>
+        </w:tc>
+        <w:tc>
+          <w:tcPr>
+            <w:tcW w:type="dxa" w:w="5473"/>
+            <w:tcBorders>
+              <w:top w:val="single" w:color="BFC5CC" w:sz="4"/>
+              <w:left w:val="single" w:color="BFC5CC" w:sz="4"/>
+              <w:bottom w:val="single" w:color="BFC5CC" w:sz="4"/>
+              <w:right w:val="single" w:color="BFC5CC" w:sz="4"/>
+            </w:tcBorders>
+            <w:tcMar>
+              <w:top w:type="dxa" w:w="60"/>
+              <w:left w:type="dxa" w:w="100"/>
+              <w:bottom w:type="dxa" w:w="60"/>
+              <w:right w:type="dxa" w:w="100"/>
+            </w:tcMar>
+          </w:tcPr>
+          <w:p>
+            <w:r>
+              <w:rPr>
+                <w:rFonts w:ascii="Calibri" w:cs="Calibri" w:eastAsia="Calibri" w:hAnsi="Calibri"/>
+                <w:sz w:val="20"/>
+                <w:szCs w:val="20"/>
+              </w:rPr>
+              <w:t xml:space="preserve">Bypass y MPPT arrancan con </w:t>
+            </w:r>
+            <w:r>
+              <w:rPr>
+                <w:rFonts w:ascii="Calibri" w:cs="Calibri" w:eastAsia="Calibri" w:hAnsi="Calibri"/>
+                <w:b/>
+                <w:bCs/>
+                <w:sz w:val="20"/>
+                <w:szCs w:val="20"/>
+              </w:rPr>
+              <w:t xml:space="preserve">Panel del proyecto (…)</w:t>
+            </w:r>
+            <w:r>
+              <w:rPr>
+                <w:rFonts w:ascii="Calibri" w:cs="Calibri" w:eastAsia="Calibri" w:hAnsi="Calibri"/>
+                <w:sz w:val="20"/>
+                <w:szCs w:val="20"/>
+              </w:rPr>
+              <w:t xml:space="preserve"> y el N serie × N paralelo de cada superficie</w:t>
+            </w:r>
+          </w:p>
+        </w:tc>
+        <w:tc>
+          <w:tcPr>
+            <w:tcW w:type="dxa" w:w="2453"/>
+            <w:tcBorders>
+              <w:top w:val="single" w:color="BFC5CC" w:sz="4"/>
+              <w:left w:val="single" w:color="BFC5CC" w:sz="4"/>
+              <w:bottom w:val="single" w:color="BFC5CC" w:sz="4"/>
+              <w:right w:val="single" w:color="BFC5CC" w:sz="4"/>
+            </w:tcBorders>
+            <w:tcMar>
+              <w:top w:type="dxa" w:w="60"/>
+              <w:left w:type="dxa" w:w="100"/>
+              <w:bottom w:type="dxa" w:w="60"/>
+              <w:right w:type="dxa" w:w="100"/>
+            </w:tcMar>
+          </w:tcPr>
+          <w:p>
+            <w:r>
+              <w:rPr>
+                <w:rFonts w:ascii="Calibri" w:cs="Calibri" w:eastAsia="Calibri" w:hAnsi="Calibri"/>
+                <w:sz w:val="20"/>
+                <w:szCs w:val="20"/>
+              </w:rPr>
+              <w:t xml:space="preserve">Arrancaban con </w:t>
+            </w:r>
+            <w:r>
+              <w:rPr>
+                <w:rFonts w:ascii="Calibri" w:cs="Calibri" w:eastAsia="Calibri" w:hAnsi="Calibri"/>
+                <w:i/>
+                <w:iCs/>
+                <w:sz w:val="20"/>
+                <w:szCs w:val="20"/>
+              </w:rPr>
+              <w:t xml:space="preserve">ASP-ST1-T40</w:t>
+            </w:r>
+            <w:r>
+              <w:rPr>
+                <w:rFonts w:ascii="Calibri" w:cs="Calibri" w:eastAsia="Calibri" w:hAnsi="Calibri"/>
+                <w:sz w:val="20"/>
+                <w:szCs w:val="20"/>
+              </w:rPr>
+              <w:t xml:space="preserve"> y 8 módulos en serie</w:t>
+            </w:r>
+          </w:p>
+        </w:tc>
+      </w:tr>
+      <w:tr>
+        <w:trPr>
+          <w:tblHeader w:val="false"/>
+        </w:trPr>
+        <w:tc>
+          <w:tcPr>
+            <w:tcW w:type="dxa" w:w="1100"/>
+            <w:tcBorders>
+              <w:top w:val="single" w:color="BFC5CC" w:sz="4"/>
+              <w:left w:val="single" w:color="BFC5CC" w:sz="4"/>
+              <w:bottom w:val="single" w:color="BFC5CC" w:sz="4"/>
+              <w:right w:val="single" w:color="BFC5CC" w:sz="4"/>
+            </w:tcBorders>
+            <w:tcMar>
+              <w:top w:type="dxa" w:w="60"/>
+              <w:left w:type="dxa" w:w="100"/>
+              <w:bottom w:type="dxa" w:w="60"/>
+              <w:right w:type="dxa" w:w="100"/>
+            </w:tcMar>
+          </w:tcPr>
+          <w:p>
+            <w:r>
+              <w:rPr>
+                <w:rFonts w:ascii="Calibri" w:cs="Calibri" w:eastAsia="Calibri" w:hAnsi="Calibri"/>
+                <w:b/>
+                <w:bCs/>
+                <w:sz w:val="20"/>
+                <w:szCs w:val="20"/>
+              </w:rPr>
+              <w:t xml:space="preserve">Mapa de calor POA</w:t>
+            </w:r>
+          </w:p>
+        </w:tc>
+        <w:tc>
+          <w:tcPr>
+            <w:tcW w:type="dxa" w:w="5473"/>
+            <w:tcBorders>
+              <w:top w:val="single" w:color="BFC5CC" w:sz="4"/>
+              <w:left w:val="single" w:color="BFC5CC" w:sz="4"/>
+              <w:bottom w:val="single" w:color="BFC5CC" w:sz="4"/>
+              <w:right w:val="single" w:color="BFC5CC" w:sz="4"/>
+            </w:tcBorders>
+            <w:tcMar>
+              <w:top w:type="dxa" w:w="60"/>
+              <w:left w:type="dxa" w:w="100"/>
+              <w:bottom w:type="dxa" w:w="60"/>
+              <w:right w:type="dxa" w:w="100"/>
+            </w:tcMar>
+          </w:tcPr>
+          <w:p>
+            <w:r>
+              <w:rPr>
+                <w:rFonts w:ascii="Calibri" w:cs="Calibri" w:eastAsia="Calibri" w:hAnsi="Calibri"/>
+                <w:sz w:val="20"/>
+                <w:szCs w:val="20"/>
+              </w:rPr>
+              <w:t xml:space="preserve">Funciona con POA por superficie</w:t>
+            </w:r>
+          </w:p>
+        </w:tc>
+        <w:tc>
+          <w:tcPr>
+            <w:tcW w:type="dxa" w:w="2453"/>
+            <w:tcBorders>
+              <w:top w:val="single" w:color="BFC5CC" w:sz="4"/>
+              <w:left w:val="single" w:color="BFC5CC" w:sz="4"/>
+              <w:bottom w:val="single" w:color="BFC5CC" w:sz="4"/>
+              <w:right w:val="single" w:color="BFC5CC" w:sz="4"/>
+            </w:tcBorders>
+            <w:tcMar>
+              <w:top w:type="dxa" w:w="60"/>
+              <w:left w:type="dxa" w:w="100"/>
+              <w:bottom w:type="dxa" w:w="60"/>
+              <w:right w:type="dxa" w:w="100"/>
+            </w:tcMar>
+          </w:tcPr>
+          <w:p>
+            <w:r>
+              <w:rPr>
+                <w:rFonts w:ascii="Calibri" w:cs="Calibri" w:eastAsia="Calibri" w:hAnsi="Calibri"/>
+                <w:sz w:val="20"/>
+                <w:szCs w:val="20"/>
+              </w:rPr>
+              <w:t xml:space="preserve">Se caía con «The truth value of a DataFrame is ambiguous»</w:t>
+            </w:r>
+          </w:p>
+        </w:tc>
+      </w:tr>
+      <w:tr>
+        <w:trPr>
+          <w:tblHeader w:val="false"/>
+        </w:trPr>
+        <w:tc>
+          <w:tcPr>
+            <w:tcW w:type="dxa" w:w="1100"/>
+            <w:tcBorders>
+              <w:top w:val="single" w:color="BFC5CC" w:sz="4"/>
+              <w:left w:val="single" w:color="BFC5CC" w:sz="4"/>
+              <w:bottom w:val="single" w:color="BFC5CC" w:sz="4"/>
+              <w:right w:val="single" w:color="BFC5CC" w:sz="4"/>
+            </w:tcBorders>
+            <w:tcMar>
+              <w:top w:type="dxa" w:w="60"/>
+              <w:left w:type="dxa" w:w="100"/>
+              <w:bottom w:type="dxa" w:w="60"/>
+              <w:right w:type="dxa" w:w="100"/>
+            </w:tcMar>
+          </w:tcPr>
+          <w:p>
+            <w:r>
+              <w:rPr>
+                <w:rFonts w:ascii="Calibri" w:cs="Calibri" w:eastAsia="Calibri" w:hAnsi="Calibri"/>
+                <w:b/>
+                <w:bCs/>
+                <w:sz w:val="20"/>
+                <w:szCs w:val="20"/>
+              </w:rPr>
+              <w:t xml:space="preserve">Sombra v2</w:t>
+            </w:r>
+          </w:p>
+        </w:tc>
+        <w:tc>
+          <w:tcPr>
+            <w:tcW w:type="dxa" w:w="5473"/>
+            <w:tcBorders>
+              <w:top w:val="single" w:color="BFC5CC" w:sz="4"/>
+              <w:left w:val="single" w:color="BFC5CC" w:sz="4"/>
+              <w:bottom w:val="single" w:color="BFC5CC" w:sz="4"/>
+              <w:right w:val="single" w:color="BFC5CC" w:sz="4"/>
+            </w:tcBorders>
+            <w:tcMar>
+              <w:top w:type="dxa" w:w="60"/>
+              <w:left w:type="dxa" w:w="100"/>
+              <w:bottom w:type="dxa" w:w="60"/>
+              <w:right w:type="dxa" w:w="100"/>
+            </w:tcMar>
+          </w:tcPr>
+          <w:p>
+            <w:r>
+              <w:rPr>
+                <w:rFonts w:ascii="Calibri" w:cs="Calibri" w:eastAsia="Calibri" w:hAnsi="Calibri"/>
+                <w:sz w:val="20"/>
+                <w:szCs w:val="20"/>
+              </w:rPr>
+              <w:t xml:space="preserve">Las horas con el sol detrás del módulo no cuentan como sombra</w:t>
+            </w:r>
+          </w:p>
+        </w:tc>
+        <w:tc>
+          <w:tcPr>
+            <w:tcW w:type="dxa" w:w="2453"/>
+            <w:tcBorders>
+              <w:top w:val="single" w:color="BFC5CC" w:sz="4"/>
+              <w:left w:val="single" w:color="BFC5CC" w:sz="4"/>
+              <w:bottom w:val="single" w:color="BFC5CC" w:sz="4"/>
+              <w:right w:val="single" w:color="BFC5CC" w:sz="4"/>
+            </w:tcBorders>
+            <w:tcMar>
+              <w:top w:type="dxa" w:w="60"/>
+              <w:left w:type="dxa" w:w="100"/>
+              <w:bottom w:type="dxa" w:w="60"/>
+              <w:right w:type="dxa" w:w="100"/>
+            </w:tcMar>
+          </w:tcPr>
+          <w:p>
+            <w:r>
+              <w:rPr>
+                <w:rFonts w:ascii="Calibri" w:cs="Calibri" w:eastAsia="Calibri" w:hAnsi="Calibri"/>
+                <w:sz w:val="20"/>
+                <w:szCs w:val="20"/>
+              </w:rPr>
+              <w:t xml:space="preserve">Se contaba sombra total en esas horas</w:t>
+            </w:r>
+          </w:p>
+        </w:tc>
+      </w:tr>
+    </w:tbl>
+    <w:p/>
+    <w:p>
+      <w:pPr>
+        <w:spacing w:after="120"/>
+      </w:pPr>
+      <w:r>
+        <w:rPr>
+          <w:rFonts w:ascii="Calibri" w:cs="Calibri" w:eastAsia="Calibri" w:hAnsi="Calibri"/>
+        </w:rPr>
+        <w:t xml:space="preserve">🚩 </w:t>
+      </w:r>
+      <w:r>
+        <w:rPr>
+          <w:rFonts w:ascii="Calibri" w:cs="Calibri" w:eastAsia="Calibri" w:hAnsi="Calibri"/>
+          <w:b/>
+          <w:bCs/>
+        </w:rPr>
+        <w:t xml:space="preserve">Después de esta actualización, en tus proyectos:</w:t>
+      </w:r>
+    </w:p>
+    <w:p>
+      <w:pPr>
+        <w:pStyle w:val="ListParagraph"/>
+        <w:numPr>
+          <w:ilvl w:val="0"/>
+          <w:numId w:val="2"/>
+        </w:numPr>
+      </w:pPr>
+      <w:r>
+        <w:rPr>
+          <w:rFonts w:ascii="Calibri" w:cs="Calibri" w:eastAsia="Calibri" w:hAnsi="Calibri"/>
+        </w:rPr>
+        <w:t xml:space="preserve">Presiona </w:t>
+      </w:r>
+      <w:r>
+        <w:rPr>
+          <w:rFonts w:ascii="Calibri" w:cs="Calibri" w:eastAsia="Calibri" w:hAnsi="Calibri"/>
+          <w:b/>
+          <w:bCs/>
+        </w:rPr>
+        <w:t xml:space="preserve">⚡ Calcular POA para todas las superficies</w:t>
+      </w:r>
+      <w:r>
+        <w:rPr>
+          <w:rFonts w:ascii="Calibri" w:cs="Calibri" w:eastAsia="Calibri" w:hAnsi="Calibri"/>
+        </w:rPr>
+        <w:t xml:space="preserve">.</w:t>
+      </w:r>
+    </w:p>
+    <w:p>
+      <w:pPr>
+        <w:pStyle w:val="ListParagraph"/>
+        <w:numPr>
+          <w:ilvl w:val="0"/>
+          <w:numId w:val="2"/>
+        </w:numPr>
+      </w:pPr>
+      <w:r>
+        <w:rPr>
+          <w:rFonts w:ascii="Calibri" w:cs="Calibri" w:eastAsia="Calibri" w:hAnsi="Calibri"/>
+        </w:rPr>
+        <w:t xml:space="preserve">Presiona </w:t>
+      </w:r>
+      <w:r>
+        <w:rPr>
+          <w:rFonts w:ascii="Calibri" w:cs="Calibri" w:eastAsia="Calibri" w:hAnsi="Calibri"/>
+          <w:b/>
+          <w:bCs/>
+        </w:rPr>
+        <w:t xml:space="preserve">🌳 Calcular sombra de todas las superficies</w:t>
+      </w:r>
+      <w:r>
+        <w:rPr>
+          <w:rFonts w:ascii="Calibri" w:cs="Calibri" w:eastAsia="Calibri" w:hAnsi="Calibri"/>
+        </w:rPr>
+        <w:t xml:space="preserve"> (antes no quedaba guardada).</w:t>
+      </w:r>
+    </w:p>
+    <w:p>
+      <w:pPr>
+        <w:pStyle w:val="ListParagraph"/>
+        <w:numPr>
+          <w:ilvl w:val="0"/>
+          <w:numId w:val="2"/>
+        </w:numPr>
+      </w:pPr>
+      <w:r>
+        <w:rPr>
+          <w:rFonts w:ascii="Calibri" w:cs="Calibri" w:eastAsia="Calibri" w:hAnsi="Calibri"/>
+        </w:rPr>
+        <w:t xml:space="preserve">Si usabas el bypass por superficie, vuelve a calcularlo: ahora usa el panel y los strings del proyecto.</w:t>
+      </w:r>
+    </w:p>
+    <w:p>
+      <w:pPr>
+        <w:pStyle w:val="ListParagraph"/>
+        <w:numPr>
+          <w:ilvl w:val="0"/>
+          <w:numId w:val="2"/>
+        </w:numPr>
+      </w:pPr>
+      <w:r>
+        <w:rPr>
+          <w:rFonts w:ascii="Calibri" w:cs="Calibri" w:eastAsia="Calibri" w:hAnsi="Calibri"/>
+        </w:rPr>
+        <w:t xml:space="preserve">Vuelve a publicar la energía con el botón que elijas: si el banner dice </w:t>
+      </w:r>
+      <w:r>
+        <w:rPr>
+          <w:rFonts w:ascii="Calibri" w:cs="Calibri" w:eastAsia="Calibri" w:hAnsi="Calibri"/>
+          <w:b/>
+          <w:bCs/>
+        </w:rPr>
+        <w:t xml:space="preserve">origen desconocido</w:t>
+      </w:r>
+      <w:r>
+        <w:rPr>
+          <w:rFonts w:ascii="Calibri" w:cs="Calibri" w:eastAsia="Calibri" w:hAnsi="Calibri"/>
+        </w:rPr>
+        <w:t xml:space="preserve">, es energía de la versión anterior.</w:t>
+      </w:r>
+    </w:p>
     <w:p>
       <w:pPr>
         <w:pStyle w:val="Heading1"/>
@@ -3383,6 +4415,64 @@
     </w:p>
     <w:p>
       <w:pPr>
+        <w:pBdr>
+          <w:left w:val="single" w:color="E3A008" w:sz="18" w:space="8"/>
+        </w:pBdr>
+        <w:shd w:fill="FFF8E1" w:color="auto" w:val="clear"/>
+        <w:spacing w:after="120" w:before="120"/>
+        <w:ind w:left="360"/>
+      </w:pPr>
+      <w:r>
+        <w:rPr>
+          <w:rFonts w:ascii="Calibri" w:cs="Calibri" w:eastAsia="Calibri" w:hAnsi="Calibri"/>
+        </w:rPr>
+        <w:t xml:space="preserve">ℹ️ El </w:t>
+      </w:r>
+      <w:r>
+        <w:rPr>
+          <w:rFonts w:ascii="Calibri" w:cs="Calibri" w:eastAsia="Calibri" w:hAnsi="Calibri"/>
+          <w:b/>
+          <w:bCs/>
+        </w:rPr>
+        <w:t xml:space="preserve">N serie</w:t>
+      </w:r>
+      <w:r>
+        <w:rPr>
+          <w:rFonts w:ascii="Calibri" w:cs="Calibri" w:eastAsia="Calibri" w:hAnsi="Calibri"/>
+        </w:rPr>
+        <w:t xml:space="preserve"> y el </w:t>
+      </w:r>
+      <w:r>
+        <w:rPr>
+          <w:rFonts w:ascii="Calibri" w:cs="Calibri" w:eastAsia="Calibri" w:hAnsi="Calibri"/>
+          <w:b/>
+          <w:bCs/>
+        </w:rPr>
+        <w:t xml:space="preserve">N paralelo</w:t>
+      </w:r>
+      <w:r>
+        <w:rPr>
+          <w:rFonts w:ascii="Calibri" w:cs="Calibri" w:eastAsia="Calibri" w:hAnsi="Calibri"/>
+        </w:rPr>
+        <w:t xml:space="preserve"> de cada superficie se escriben </w:t>
+      </w:r>
+      <w:r>
+        <w:rPr>
+          <w:rFonts w:ascii="Calibri" w:cs="Calibri" w:eastAsia="Calibri" w:hAnsi="Calibri"/>
+          <w:b/>
+          <w:bCs/>
+        </w:rPr>
+        <w:t xml:space="preserve">solo aquí</w:t>
+      </w:r>
+      <w:r>
+        <w:rPr>
+          <w:rFonts w:ascii="Calibri" w:cs="Calibri" w:eastAsia="Calibri" w:hAnsi="Calibri"/>
+        </w:rPr>
+        <w:t xml:space="preserve">: los usan también el bypass por superficie, el MPPT combinado y el modo físico.</w:t>
+      </w:r>
+    </w:p>
+    <w:p>
+      <w:pPr>
         <w:pStyle w:val="Heading2"/>
       </w:pPr>
       <w:r>
@@ -4380,7 +5470,35 @@
         <w:rPr>
           <w:rFonts w:ascii="Calibri" w:cs="Calibri" w:eastAsia="Calibri" w:hAnsi="Calibri"/>
         </w:rPr>
-        <w:t xml:space="preserve">; si algo cambió desde la comparación, rechaza la adopción y te dice por qué.</w:t>
+        <w:t xml:space="preserve">; si algo cambió desde la comparación, rechaza la adopción y te dice por qué. Si ya hay energía publicada de otro origen, primero pregunta </w:t>
+      </w:r>
+      <w:r>
+        <w:rPr>
+          <w:rFonts w:ascii="Calibri" w:cs="Calibri" w:eastAsia="Calibri" w:hAnsi="Calibri"/>
+          <w:i/>
+          <w:iCs/>
+        </w:rPr>
+        <w:t xml:space="preserve">¿Reemplazarla por…?</w:t>
+      </w:r>
+      <w:r>
+        <w:rPr>
+          <w:rFonts w:ascii="Calibri" w:cs="Calibri" w:eastAsia="Calibri" w:hAnsi="Calibri"/>
+        </w:rPr>
+        <w:t xml:space="preserve">; al confirmar vuelve a revalidar. El banner queda con origen </w:t>
+      </w:r>
+      <w:r>
+        <w:rPr>
+          <w:rFonts w:ascii="Calibri" w:cs="Calibri" w:eastAsia="Calibri" w:hAnsi="Calibri"/>
+          <w:b/>
+          <w:bCs/>
+        </w:rPr>
+        <w:t xml:space="preserve">físico</w:t>
+      </w:r>
+      <w:r>
+        <w:rPr>
+          <w:rFonts w:ascii="Calibri" w:cs="Calibri" w:eastAsia="Calibri" w:hAnsi="Calibri"/>
+        </w:rPr>
+        <w:t xml:space="preserve"> y muestra el recorte en buses de inversor.</w:t>
       </w:r>
     </w:p>
     <w:p>
@@ -4507,6 +5625,35 @@
     </w:p>
     <w:p>
       <w:pPr>
+        <w:pStyle w:val="ListParagraph"/>
+        <w:numPr>
+          <w:ilvl w:val="0"/>
+          <w:numId w:val="3"/>
+        </w:numPr>
+      </w:pPr>
+      <w:r>
+        <w:rPr>
+          <w:rFonts w:ascii="Calibri" w:cs="Calibri" w:eastAsia="Calibri" w:hAnsi="Calibri"/>
+        </w:rPr>
+        <w:t xml:space="preserve">Solo usa POA </w:t>
+      </w:r>
+      <w:r>
+        <w:rPr>
+          <w:rFonts w:ascii="Calibri" w:cs="Calibri" w:eastAsia="Calibri" w:hAnsi="Calibri"/>
+          <w:b/>
+          <w:bCs/>
+        </w:rPr>
+        <w:t xml:space="preserve">vigentes</w:t>
+      </w:r>
+      <w:r>
+        <w:rPr>
+          <w:rFonts w:ascii="Calibri" w:cs="Calibri" w:eastAsia="Calibri" w:hAnsi="Calibri"/>
+        </w:rPr>
+        <w:t xml:space="preserve">. Una superficie sin POA vigente aparece en el aviso ⚠️ y se colorea con una estimación desde la irradiancia global (no con su POA anterior); en la tabla del mes figura con 0.</w:t>
+      </w:r>
+    </w:p>
+    <w:p>
+      <w:pPr>
         <w:pStyle w:val="Heading1"/>
       </w:pPr>
       <w:r>
@@ -4524,7 +5671,21 @@
         <w:rPr>
           <w:rFonts w:ascii="Calibri" w:cs="Calibri" w:eastAsia="Calibri" w:hAnsi="Calibri"/>
         </w:rPr>
-        <w:t xml:space="preserve">Requiere la POA del paso 4.</w:t>
+        <w:t xml:space="preserve">Requiere la POA del paso 4. Solo usa POA </w:t>
+      </w:r>
+      <w:r>
+        <w:rPr>
+          <w:rFonts w:ascii="Calibri" w:cs="Calibri" w:eastAsia="Calibri" w:hAnsi="Calibri"/>
+          <w:b/>
+          <w:bCs/>
+        </w:rPr>
+        <w:t xml:space="preserve">vigentes</w:t>
+      </w:r>
+      <w:r>
+        <w:rPr>
+          <w:rFonts w:ascii="Calibri" w:cs="Calibri" w:eastAsia="Calibri" w:hAnsi="Calibri"/>
+        </w:rPr>
+        <w:t xml:space="preserve">: las superficies sin POA vigente aparecen en el aviso ⚠️ y se omiten de las gráficas; el bypass no calcula hasta que todas las superficies activas tengan POA vigente.</w:t>
       </w:r>
     </w:p>
     <w:p>
@@ -4878,7 +6039,21 @@
         <w:rPr>
           <w:rFonts w:ascii="Calibri" w:cs="Calibri" w:eastAsia="Calibri" w:hAnsi="Calibri"/>
         </w:rPr>
-        <w:t xml:space="preserve">. Semáforo:</w:t>
+        <w:t xml:space="preserve">. El resultado indica el </w:t>
+      </w:r>
+      <w:r>
+        <w:rPr>
+          <w:rFonts w:ascii="Calibri" w:cs="Calibri" w:eastAsia="Calibri" w:hAnsi="Calibri"/>
+          <w:b/>
+          <w:bCs/>
+        </w:rPr>
+        <w:t xml:space="preserve">panel usado</w:t>
+      </w:r>
+      <w:r>
+        <w:rPr>
+          <w:rFonts w:ascii="Calibri" w:cs="Calibri" w:eastAsia="Calibri" w:hAnsi="Calibri"/>
+        </w:rPr>
+        <w:t xml:space="preserve"> (y si es distinto al del proyecto) y los strings de cada superficie con su origen. Semáforo:</w:t>
       </w:r>
     </w:p>
     <w:p>
@@ -4994,7 +6169,21 @@
         <w:rPr>
           <w:rFonts w:ascii="Calibri" w:cs="Calibri" w:eastAsia="Calibri" w:hAnsi="Calibri"/>
         </w:rPr>
-        <w:t xml:space="preserve"> (sol detrás del plano, AOI ≥ 90°) o nocturna. Con POA por superficie calculada, el mapa usa la POA de esa superficie. </w:t>
+        <w:t xml:space="preserve"> (sol detrás del plano, AOI ≥ 90°) o nocturna. Si la superficie tiene POA </w:t>
+      </w:r>
+      <w:r>
+        <w:rPr>
+          <w:rFonts w:ascii="Calibri" w:cs="Calibri" w:eastAsia="Calibri" w:hAnsi="Calibri"/>
+          <w:b/>
+          <w:bCs/>
+        </w:rPr>
+        <w:t xml:space="preserve">vigente</w:t>
+      </w:r>
+      <w:r>
+        <w:rPr>
+          <w:rFonts w:ascii="Calibri" w:cs="Calibri" w:eastAsia="Calibri" w:hAnsi="Calibri"/>
+        </w:rPr>
+        <w:t xml:space="preserve">, el mapa usa su POA; si no, usa la POA general de ☀️ Recurso Solar. </w:t>
       </w:r>
       <w:r>
         <w:rPr>
@@ -5147,83 +6336,73 @@
         <w:rPr>
           <w:rFonts w:ascii="Calibri" w:cs="Calibri" w:eastAsia="Calibri" w:hAnsi="Calibri"/>
         </w:rPr>
-        <w:t xml:space="preserve">8. Lista de verificación antes de ir a Financiero</w:t>
-      </w:r>
-    </w:p>
-    <w:p>
-      <w:pPr>
-        <w:ind w:left="360" w:hanging="360"/>
-      </w:pPr>
-      <w:r>
-        <w:rPr>
-          <w:rFonts w:ascii="Segoe UI Symbol" w:cs="Segoe UI Symbol" w:eastAsia="Segoe UI Symbol" w:hAnsi="Segoe UI Symbol"/>
-        </w:rPr>
-        <w:t xml:space="preserve">☐  </w:t>
-      </w:r>
-      <w:r>
-        <w:rPr>
-          <w:rFonts w:ascii="Calibri" w:cs="Calibri" w:eastAsia="Calibri" w:hAnsi="Calibri"/>
-        </w:rPr>
-        <w:t xml:space="preserve">Recurso Solar ✅ y TMY vigente.</w:t>
-      </w:r>
-    </w:p>
-    <w:p>
-      <w:pPr>
-        <w:ind w:left="360" w:hanging="360"/>
-      </w:pPr>
-      <w:r>
-        <w:rPr>
-          <w:rFonts w:ascii="Segoe UI Symbol" w:cs="Segoe UI Symbol" w:eastAsia="Segoe UI Symbol" w:hAnsi="Segoe UI Symbol"/>
-        </w:rPr>
-        <w:t xml:space="preserve">☐  </w:t>
-      </w:r>
-      <w:r>
-        <w:rPr>
-          <w:rFonts w:ascii="Calibri" w:cs="Calibri" w:eastAsia="Calibri" w:hAnsi="Calibri"/>
-        </w:rPr>
-        <w:t xml:space="preserve">Todas las superficies reales creadas, con tilt, azimut y área correctos, y las que no existen desactivadas.</w:t>
-      </w:r>
-    </w:p>
-    <w:p>
-      <w:pPr>
-        <w:ind w:left="360" w:hanging="360"/>
-      </w:pPr>
-      <w:r>
-        <w:rPr>
-          <w:rFonts w:ascii="Segoe UI Symbol" w:cs="Segoe UI Symbol" w:eastAsia="Segoe UI Symbol" w:hAnsi="Segoe UI Symbol"/>
-        </w:rPr>
-        <w:t xml:space="preserve">☐  </w:t>
-      </w:r>
-      <w:r>
-        <w:rPr>
-          <w:rFonts w:ascii="Calibri" w:cs="Calibri" w:eastAsia="Calibri" w:hAnsi="Calibri"/>
-        </w:rPr>
-        <w:t xml:space="preserve">Montaje "Ventilada" solo donde existe físicamente.</w:t>
-      </w:r>
-    </w:p>
-    <w:p>
-      <w:pPr>
-        <w:ind w:left="360" w:hanging="360"/>
-      </w:pPr>
-      <w:r>
-        <w:rPr>
-          <w:rFonts w:ascii="Segoe UI Symbol" w:cs="Segoe UI Symbol" w:eastAsia="Segoe UI Symbol" w:hAnsi="Segoe UI Symbol"/>
-        </w:rPr>
-        <w:t xml:space="preserve">☐  </w:t>
-      </w:r>
-      <w:r>
-        <w:rPr>
-          <w:rFonts w:ascii="Calibri" w:cs="Calibri" w:eastAsia="Calibri" w:hAnsi="Calibri"/>
-        </w:rPr>
-        <w:t xml:space="preserve">Ningún aviso </w:t>
-      </w:r>
-      <w:r>
-        <w:rPr>
-          <w:rFonts w:ascii="Calibri" w:cs="Calibri" w:eastAsia="Calibri" w:hAnsi="Calibri"/>
-          <w:b/>
-          <w:bCs/>
-        </w:rPr>
-        <w:t xml:space="preserve">⚠️ Estas superficies no tienen POA vigente…</w:t>
+        <w:t xml:space="preserve">8. Guardar y cargar un proyecto con varias superficies</w:t>
+      </w:r>
+    </w:p>
+    <w:p>
+      <w:pPr>
+        <w:pStyle w:val="ListParagraph"/>
+        <w:numPr>
+          <w:ilvl w:val="0"/>
+          <w:numId w:val="3"/>
+        </w:numPr>
+      </w:pPr>
+      <w:r>
+        <w:rPr>
+          <w:rFonts w:ascii="Calibri" w:cs="Calibri" w:eastAsia="Calibri" w:hAnsi="Calibri"/>
+        </w:rPr>
+        <w:t xml:space="preserve">El estado multi-superficie (superficies, inversores, energía publicada y su origen) se guarda con el proyecto </w:t>
+      </w:r>
+      <w:r>
+        <w:rPr>
+          <w:rFonts w:ascii="Calibri" w:cs="Calibri" w:eastAsia="Calibri" w:hAnsi="Calibri"/>
+          <w:b/>
+          <w:bCs/>
+        </w:rPr>
+        <w:t xml:space="preserve">solo si hay energía publicada</w:t>
+      </w:r>
+      <w:r>
+        <w:rPr>
+          <w:rFonts w:ascii="Calibri" w:cs="Calibri" w:eastAsia="Calibri" w:hAnsi="Calibri"/>
+        </w:rPr>
+        <w:t xml:space="preserve"> (banner ✅ activo). Publica antes de guardar si quieres conservar las superficies.</w:t>
+      </w:r>
+    </w:p>
+    <w:p>
+      <w:pPr>
+        <w:pStyle w:val="ListParagraph"/>
+        <w:numPr>
+          <w:ilvl w:val="0"/>
+          <w:numId w:val="3"/>
+        </w:numPr>
+      </w:pPr>
+      <w:r>
+        <w:rPr>
+          <w:rFonts w:ascii="Calibri" w:cs="Calibri" w:eastAsia="Calibri" w:hAnsi="Calibri"/>
+        </w:rPr>
+        <w:t xml:space="preserve">El </w:t>
+      </w:r>
+      <w:r>
+        <w:rPr>
+          <w:rFonts w:ascii="Calibri" w:cs="Calibri" w:eastAsia="Calibri" w:hAnsi="Calibri"/>
+          <w:b/>
+          <w:bCs/>
+        </w:rPr>
+        <w:t xml:space="preserve">proyecto físico</w:t>
+      </w:r>
+      <w:r>
+        <w:rPr>
+          <w:rFonts w:ascii="Calibri" w:cs="Calibri" w:eastAsia="Calibri" w:hAnsi="Calibri"/>
+        </w:rPr>
+        <w:t xml:space="preserve"> solo se guarda si el origen vigente es </w:t>
+      </w:r>
+      <w:r>
+        <w:rPr>
+          <w:rFonts w:ascii="Calibri" w:cs="Calibri" w:eastAsia="Calibri" w:hAnsi="Calibri"/>
+          <w:b/>
+          <w:bCs/>
+        </w:rPr>
+        <w:t xml:space="preserve">físico</w:t>
       </w:r>
       <w:r>
         <w:rPr>
@@ -5234,19 +6413,31 @@
     </w:p>
     <w:p>
       <w:pPr>
-        <w:ind w:left="360" w:hanging="360"/>
-      </w:pPr>
-      <w:r>
-        <w:rPr>
-          <w:rFonts w:ascii="Segoe UI Symbol" w:cs="Segoe UI Symbol" w:eastAsia="Segoe UI Symbol" w:hAnsi="Segoe UI Symbol"/>
-        </w:rPr>
-        <w:t xml:space="preserve">☐  </w:t>
-      </w:r>
-      <w:r>
-        <w:rPr>
-          <w:rFonts w:ascii="Calibri" w:cs="Calibri" w:eastAsia="Calibri" w:hAnsi="Calibri"/>
-        </w:rPr>
-        <w:t xml:space="preserve">Si usas sombra 3D: escena del sitio correcto, puntos fuera del volumen (20–50 cm) y todas las superficies en 🟢 en </w:t>
+        <w:pStyle w:val="ListParagraph"/>
+        <w:numPr>
+          <w:ilvl w:val="0"/>
+          <w:numId w:val="3"/>
+        </w:numPr>
+      </w:pPr>
+      <w:r>
+        <w:rPr>
+          <w:rFonts w:ascii="Calibri" w:cs="Calibri" w:eastAsia="Calibri" w:hAnsi="Calibri"/>
+        </w:rPr>
+        <w:t xml:space="preserve">Al cargar el proyecto, el estado multi-superficie se restaura cuando pasas por </w:t>
+      </w:r>
+      <w:r>
+        <w:rPr>
+          <w:rFonts w:ascii="Calibri" w:cs="Calibri" w:eastAsia="Calibri" w:hAnsi="Calibri"/>
+          <w:b/>
+          <w:bCs/>
+        </w:rPr>
+        <w:t xml:space="preserve">☀️ Recurso Solar</w:t>
+      </w:r>
+      <w:r>
+        <w:rPr>
+          <w:rFonts w:ascii="Calibri" w:cs="Calibri" w:eastAsia="Calibri" w:hAnsi="Calibri"/>
+        </w:rPr>
+        <w:t xml:space="preserve"> con el TMY: verás </w:t>
       </w:r>
       <w:r>
         <w:rPr>
@@ -5254,6 +6445,259 @@
           <w:i/>
           <w:iCs/>
         </w:rPr>
+        <w:t xml:space="preserve">📂 Estado multi-superficie restaurado…</w:t>
+      </w:r>
+      <w:r>
+        <w:rPr>
+          <w:rFonts w:ascii="Calibri" w:cs="Calibri" w:eastAsia="Calibri" w:hAnsi="Calibri"/>
+        </w:rPr>
+        <w:t xml:space="preserve"> o, si el TMY o las firmas no coinciden, </w:t>
+      </w:r>
+      <w:r>
+        <w:rPr>
+          <w:rFonts w:ascii="Calibri" w:cs="Calibri" w:eastAsia="Calibri" w:hAnsi="Calibri"/>
+          <w:i/>
+          <w:iCs/>
+        </w:rPr>
+        <w:t xml:space="preserve">…rechazado</w:t>
+      </w:r>
+      <w:r>
+        <w:rPr>
+          <w:rFonts w:ascii="Calibri" w:cs="Calibri" w:eastAsia="Calibri" w:hAnsi="Calibri"/>
+        </w:rPr>
+        <w:t xml:space="preserve"> con el motivo.</w:t>
+      </w:r>
+    </w:p>
+    <w:p>
+      <w:pPr>
+        <w:pStyle w:val="ListParagraph"/>
+        <w:numPr>
+          <w:ilvl w:val="0"/>
+          <w:numId w:val="3"/>
+        </w:numPr>
+      </w:pPr>
+      <w:r>
+        <w:rPr>
+          <w:rFonts w:ascii="Calibri" w:cs="Calibri" w:eastAsia="Calibri" w:hAnsi="Calibri"/>
+        </w:rPr>
+        <w:t xml:space="preserve">La </w:t>
+      </w:r>
+      <w:r>
+        <w:rPr>
+          <w:rFonts w:ascii="Calibri" w:cs="Calibri" w:eastAsia="Calibri" w:hAnsi="Calibri"/>
+          <w:b/>
+          <w:bCs/>
+        </w:rPr>
+        <w:t xml:space="preserve">POA por superficie no se guarda</w:t>
+      </w:r>
+      <w:r>
+        <w:rPr>
+          <w:rFonts w:ascii="Calibri" w:cs="Calibri" w:eastAsia="Calibri" w:hAnsi="Calibri"/>
+        </w:rPr>
+        <w:t xml:space="preserve">: al abrir el proyecto aparece como «POA sin calcular»; presiona </w:t>
+      </w:r>
+      <w:r>
+        <w:rPr>
+          <w:rFonts w:ascii="Calibri" w:cs="Calibri" w:eastAsia="Calibri" w:hAnsi="Calibri"/>
+          <w:b/>
+          <w:bCs/>
+        </w:rPr>
+        <w:t xml:space="preserve">⚡ Calcular POA</w:t>
+      </w:r>
+      <w:r>
+        <w:rPr>
+          <w:rFonts w:ascii="Calibri" w:cs="Calibri" w:eastAsia="Calibri" w:hAnsi="Calibri"/>
+        </w:rPr>
+        <w:t xml:space="preserve">.</w:t>
+      </w:r>
+    </w:p>
+    <w:p>
+      <w:pPr>
+        <w:pStyle w:val="ListParagraph"/>
+        <w:numPr>
+          <w:ilvl w:val="0"/>
+          <w:numId w:val="3"/>
+        </w:numPr>
+      </w:pPr>
+      <w:r>
+        <w:rPr>
+          <w:rFonts w:ascii="Calibri" w:cs="Calibri" w:eastAsia="Calibri" w:hAnsi="Calibri"/>
+        </w:rPr>
+        <w:t xml:space="preserve">Los </w:t>
+      </w:r>
+      <w:r>
+        <w:rPr>
+          <w:rFonts w:ascii="Calibri" w:cs="Calibri" w:eastAsia="Calibri" w:hAnsi="Calibri"/>
+          <w:b/>
+          <w:bCs/>
+        </w:rPr>
+        <w:t xml:space="preserve">puntos 3D</w:t>
+      </w:r>
+      <w:r>
+        <w:rPr>
+          <w:rFonts w:ascii="Calibri" w:cs="Calibri" w:eastAsia="Calibri" w:hAnsi="Calibri"/>
+        </w:rPr>
+        <w:t xml:space="preserve"> se conservan y siguen ligados a su superficie.</w:t>
+      </w:r>
+    </w:p>
+    <w:p>
+      <w:pPr>
+        <w:pStyle w:val="ListParagraph"/>
+        <w:numPr>
+          <w:ilvl w:val="0"/>
+          <w:numId w:val="3"/>
+        </w:numPr>
+      </w:pPr>
+      <w:r>
+        <w:rPr>
+          <w:rFonts w:ascii="Calibri" w:cs="Calibri" w:eastAsia="Calibri" w:hAnsi="Calibri"/>
+        </w:rPr>
+        <w:t xml:space="preserve">Proyectos guardados antes del 24-sep-2026: si traían proyecto físico se restauran con origen </w:t>
+      </w:r>
+      <w:r>
+        <w:rPr>
+          <w:rFonts w:ascii="Calibri" w:cs="Calibri" w:eastAsia="Calibri" w:hAnsi="Calibri"/>
+          <w:b/>
+          <w:bCs/>
+        </w:rPr>
+        <w:t xml:space="preserve">físico</w:t>
+      </w:r>
+      <w:r>
+        <w:rPr>
+          <w:rFonts w:ascii="Calibri" w:cs="Calibri" w:eastAsia="Calibri" w:hAnsi="Calibri"/>
+        </w:rPr>
+        <w:t xml:space="preserve">; los demás muestran </w:t>
+      </w:r>
+      <w:r>
+        <w:rPr>
+          <w:rFonts w:ascii="Calibri" w:cs="Calibri" w:eastAsia="Calibri" w:hAnsi="Calibri"/>
+          <w:b/>
+          <w:bCs/>
+        </w:rPr>
+        <w:t xml:space="preserve">origen desconocido</w:t>
+      </w:r>
+      <w:r>
+        <w:rPr>
+          <w:rFonts w:ascii="Calibri" w:cs="Calibri" w:eastAsia="Calibri" w:hAnsi="Calibri"/>
+        </w:rPr>
+        <w:t xml:space="preserve"> hasta que vuelvas a publicar.</w:t>
+      </w:r>
+    </w:p>
+    <w:p>
+      <w:pPr>
+        <w:pStyle w:val="Heading1"/>
+      </w:pPr>
+      <w:r>
+        <w:rPr>
+          <w:rFonts w:ascii="Calibri" w:cs="Calibri" w:eastAsia="Calibri" w:hAnsi="Calibri"/>
+        </w:rPr>
+        <w:t xml:space="preserve">9. Lista de verificación antes de ir a Financiero</w:t>
+      </w:r>
+    </w:p>
+    <w:p>
+      <w:pPr>
+        <w:ind w:left="360" w:hanging="360"/>
+      </w:pPr>
+      <w:r>
+        <w:rPr>
+          <w:rFonts w:ascii="Segoe UI Symbol" w:cs="Segoe UI Symbol" w:eastAsia="Segoe UI Symbol" w:hAnsi="Segoe UI Symbol"/>
+        </w:rPr>
+        <w:t xml:space="preserve">☐  </w:t>
+      </w:r>
+      <w:r>
+        <w:rPr>
+          <w:rFonts w:ascii="Calibri" w:cs="Calibri" w:eastAsia="Calibri" w:hAnsi="Calibri"/>
+        </w:rPr>
+        <w:t xml:space="preserve">Recurso Solar ✅ y TMY vigente.</w:t>
+      </w:r>
+    </w:p>
+    <w:p>
+      <w:pPr>
+        <w:ind w:left="360" w:hanging="360"/>
+      </w:pPr>
+      <w:r>
+        <w:rPr>
+          <w:rFonts w:ascii="Segoe UI Symbol" w:cs="Segoe UI Symbol" w:eastAsia="Segoe UI Symbol" w:hAnsi="Segoe UI Symbol"/>
+        </w:rPr>
+        <w:t xml:space="preserve">☐  </w:t>
+      </w:r>
+      <w:r>
+        <w:rPr>
+          <w:rFonts w:ascii="Calibri" w:cs="Calibri" w:eastAsia="Calibri" w:hAnsi="Calibri"/>
+        </w:rPr>
+        <w:t xml:space="preserve">Todas las superficies reales creadas, con tilt, azimut y área correctos, y las que no existen desactivadas.</w:t>
+      </w:r>
+    </w:p>
+    <w:p>
+      <w:pPr>
+        <w:ind w:left="360" w:hanging="360"/>
+      </w:pPr>
+      <w:r>
+        <w:rPr>
+          <w:rFonts w:ascii="Segoe UI Symbol" w:cs="Segoe UI Symbol" w:eastAsia="Segoe UI Symbol" w:hAnsi="Segoe UI Symbol"/>
+        </w:rPr>
+        <w:t xml:space="preserve">☐  </w:t>
+      </w:r>
+      <w:r>
+        <w:rPr>
+          <w:rFonts w:ascii="Calibri" w:cs="Calibri" w:eastAsia="Calibri" w:hAnsi="Calibri"/>
+        </w:rPr>
+        <w:t xml:space="preserve">Montaje "Ventilada" solo donde existe físicamente.</w:t>
+      </w:r>
+    </w:p>
+    <w:p>
+      <w:pPr>
+        <w:ind w:left="360" w:hanging="360"/>
+      </w:pPr>
+      <w:r>
+        <w:rPr>
+          <w:rFonts w:ascii="Segoe UI Symbol" w:cs="Segoe UI Symbol" w:eastAsia="Segoe UI Symbol" w:hAnsi="Segoe UI Symbol"/>
+        </w:rPr>
+        <w:t xml:space="preserve">☐  </w:t>
+      </w:r>
+      <w:r>
+        <w:rPr>
+          <w:rFonts w:ascii="Calibri" w:cs="Calibri" w:eastAsia="Calibri" w:hAnsi="Calibri"/>
+        </w:rPr>
+        <w:t xml:space="preserve">Ningún aviso </w:t>
+      </w:r>
+      <w:r>
+        <w:rPr>
+          <w:rFonts w:ascii="Calibri" w:cs="Calibri" w:eastAsia="Calibri" w:hAnsi="Calibri"/>
+          <w:b/>
+          <w:bCs/>
+        </w:rPr>
+        <w:t xml:space="preserve">⚠️ Estas superficies no tienen POA vigente…</w:t>
+      </w:r>
+      <w:r>
+        <w:rPr>
+          <w:rFonts w:ascii="Calibri" w:cs="Calibri" w:eastAsia="Calibri" w:hAnsi="Calibri"/>
+        </w:rPr>
+        <w:t xml:space="preserve">.</w:t>
+      </w:r>
+    </w:p>
+    <w:p>
+      <w:pPr>
+        <w:ind w:left="360" w:hanging="360"/>
+      </w:pPr>
+      <w:r>
+        <w:rPr>
+          <w:rFonts w:ascii="Segoe UI Symbol" w:cs="Segoe UI Symbol" w:eastAsia="Segoe UI Symbol" w:hAnsi="Segoe UI Symbol"/>
+        </w:rPr>
+        <w:t xml:space="preserve">☐  </w:t>
+      </w:r>
+      <w:r>
+        <w:rPr>
+          <w:rFonts w:ascii="Calibri" w:cs="Calibri" w:eastAsia="Calibri" w:hAnsi="Calibri"/>
+        </w:rPr>
+        <w:t xml:space="preserve">Si usas sombra 3D: escena del sitio correcto, puntos fuera del volumen (20–50 cm) y todas las superficies en 🟢 en </w:t>
+      </w:r>
+      <w:r>
+        <w:rPr>
+          <w:rFonts w:ascii="Calibri" w:cs="Calibri" w:eastAsia="Calibri" w:hAnsi="Calibri"/>
+          <w:i/>
+          <w:iCs/>
+        </w:rPr>
         <w:t xml:space="preserve">Estado de la sombra por superficie</w:t>
       </w:r>
       <w:r>
@@ -5277,7 +6721,7 @@
         <w:rPr>
           <w:rFonts w:ascii="Calibri" w:cs="Calibri" w:eastAsia="Calibri" w:hAnsi="Calibri"/>
         </w:rPr>
-        <w:t xml:space="preserve">Inversores: ✅ Asignaciones válidas.</w:t>
+        <w:t xml:space="preserve">Inversores: ✅ Asignaciones válidas, con N serie y N paralelo en cada superficie.</w:t>
       </w:r>
     </w:p>
     <w:p>
@@ -5294,6 +6738,37 @@
         <w:rPr>
           <w:rFonts w:ascii="Calibri" w:cs="Calibri" w:eastAsia="Calibri" w:hAnsi="Calibri"/>
         </w:rPr>
+        <w:t xml:space="preserve">Bypass y MPPT con </w:t>
+      </w:r>
+      <w:r>
+        <w:rPr>
+          <w:rFonts w:ascii="Calibri" w:cs="Calibri" w:eastAsia="Calibri" w:hAnsi="Calibri"/>
+          <w:b/>
+          <w:bCs/>
+        </w:rPr>
+        <w:t xml:space="preserve">Panel del proyecto (…)</w:t>
+      </w:r>
+      <w:r>
+        <w:rPr>
+          <w:rFonts w:ascii="Calibri" w:cs="Calibri" w:eastAsia="Calibri" w:hAnsi="Calibri"/>
+        </w:rPr>
+        <w:t xml:space="preserve"> y strings «configurado en la superficie» (o una diferencia que elegiste a propósito).</w:t>
+      </w:r>
+    </w:p>
+    <w:p>
+      <w:pPr>
+        <w:ind w:left="360" w:hanging="360"/>
+      </w:pPr>
+      <w:r>
+        <w:rPr>
+          <w:rFonts w:ascii="Segoe UI Symbol" w:cs="Segoe UI Symbol" w:eastAsia="Segoe UI Symbol" w:hAnsi="Segoe UI Symbol"/>
+        </w:rPr>
+        <w:t xml:space="preserve">☐  </w:t>
+      </w:r>
+      <w:r>
+        <w:rPr>
+          <w:rFonts w:ascii="Calibri" w:cs="Calibri" w:eastAsia="Calibri" w:hAnsi="Calibri"/>
+        </w:rPr>
         <w:t xml:space="preserve">El banner ✅ Modo multi-superficie activo muestra el </w:t>
       </w:r>
       <w:r>
@@ -5319,7 +6794,7 @@
         <w:rPr>
           <w:rFonts w:ascii="Calibri" w:cs="Calibri" w:eastAsia="Calibri" w:hAnsi="Calibri"/>
         </w:rPr>
-        <w:t xml:space="preserve">9. Mensajes frecuentes y qué hacer</w:t>
+        <w:t xml:space="preserve">10. Mensajes frecuentes y qué hacer</w:t>
       </w:r>
     </w:p>
     <w:tbl>
@@ -5335,9 +6810,9 @@
         </w:tblBorders>
       </w:tblPr>
       <w:tblGrid>
-        <w:gridCol w:w="2601"/>
-        <w:gridCol w:w="3748"/>
-        <w:gridCol w:w="2677"/>
+        <w:gridCol w:w="3056"/>
+        <w:gridCol w:w="3483"/>
+        <w:gridCol w:w="2487"/>
       </w:tblGrid>
       <w:tr>
         <w:trPr>
@@ -5345,7 +6820,7 @@
         </w:trPr>
         <w:tc>
           <w:tcPr>
-            <w:tcW w:type="dxa" w:w="2601"/>
+            <w:tcW w:type="dxa" w:w="3056"/>
             <w:tcBorders>
               <w:top w:val="single" w:color="BFC5CC" w:sz="4"/>
               <w:left w:val="single" w:color="BFC5CC" w:sz="4"/>
@@ -5376,7 +6851,7 @@
         </w:tc>
         <w:tc>
           <w:tcPr>
-            <w:tcW w:type="dxa" w:w="3748"/>
+            <w:tcW w:type="dxa" w:w="3483"/>
             <w:tcBorders>
               <w:top w:val="single" w:color="BFC5CC" w:sz="4"/>
               <w:left w:val="single" w:color="BFC5CC" w:sz="4"/>
@@ -5407,7 +6882,7 @@
         </w:tc>
         <w:tc>
           <w:tcPr>
-            <w:tcW w:type="dxa" w:w="2677"/>
+            <w:tcW w:type="dxa" w:w="2487"/>
             <w:tcBorders>
               <w:top w:val="single" w:color="BFC5CC" w:sz="4"/>
               <w:left w:val="single" w:color="BFC5CC" w:sz="4"/>
@@ -5443,7 +6918,7 @@
         </w:trPr>
         <w:tc>
           <w:tcPr>
-            <w:tcW w:type="dxa" w:w="2601"/>
+            <w:tcW w:type="dxa" w:w="3056"/>
             <w:tcBorders>
               <w:top w:val="single" w:color="BFC5CC" w:sz="4"/>
               <w:left w:val="single" w:color="BFC5CC" w:sz="4"/>
@@ -5470,7 +6945,7 @@
         </w:tc>
         <w:tc>
           <w:tcPr>
-            <w:tcW w:type="dxa" w:w="3748"/>
+            <w:tcW w:type="dxa" w:w="3483"/>
             <w:tcBorders>
               <w:top w:val="single" w:color="BFC5CC" w:sz="4"/>
               <w:left w:val="single" w:color="BFC5CC" w:sz="4"/>
@@ -5497,7 +6972,7 @@
         </w:tc>
         <w:tc>
           <w:tcPr>
-            <w:tcW w:type="dxa" w:w="2677"/>
+            <w:tcW w:type="dxa" w:w="2487"/>
             <w:tcBorders>
               <w:top w:val="single" w:color="BFC5CC" w:sz="4"/>
               <w:left w:val="single" w:color="BFC5CC" w:sz="4"/>
@@ -5529,7 +7004,7 @@
         </w:trPr>
         <w:tc>
           <w:tcPr>
-            <w:tcW w:type="dxa" w:w="2601"/>
+            <w:tcW w:type="dxa" w:w="3056"/>
             <w:tcBorders>
               <w:top w:val="single" w:color="BFC5CC" w:sz="4"/>
               <w:left w:val="single" w:color="BFC5CC" w:sz="4"/>
@@ -5556,7 +7031,7 @@
         </w:tc>
         <w:tc>
           <w:tcPr>
-            <w:tcW w:type="dxa" w:w="3748"/>
+            <w:tcW w:type="dxa" w:w="3483"/>
             <w:tcBorders>
               <w:top w:val="single" w:color="BFC5CC" w:sz="4"/>
               <w:left w:val="single" w:color="BFC5CC" w:sz="4"/>
@@ -5583,7 +7058,7 @@
         </w:tc>
         <w:tc>
           <w:tcPr>
-            <w:tcW w:type="dxa" w:w="2677"/>
+            <w:tcW w:type="dxa" w:w="2487"/>
             <w:tcBorders>
               <w:top w:val="single" w:color="BFC5CC" w:sz="4"/>
               <w:left w:val="single" w:color="BFC5CC" w:sz="4"/>
@@ -5615,7 +7090,7 @@
         </w:trPr>
         <w:tc>
           <w:tcPr>
-            <w:tcW w:type="dxa" w:w="2601"/>
+            <w:tcW w:type="dxa" w:w="3056"/>
             <w:tcBorders>
               <w:top w:val="single" w:color="BFC5CC" w:sz="4"/>
               <w:left w:val="single" w:color="BFC5CC" w:sz="4"/>
@@ -5642,7 +7117,7 @@
         </w:tc>
         <w:tc>
           <w:tcPr>
-            <w:tcW w:type="dxa" w:w="3748"/>
+            <w:tcW w:type="dxa" w:w="3483"/>
             <w:tcBorders>
               <w:top w:val="single" w:color="BFC5CC" w:sz="4"/>
               <w:left w:val="single" w:color="BFC5CC" w:sz="4"/>
@@ -5669,7 +7144,7 @@
         </w:tc>
         <w:tc>
           <w:tcPr>
-            <w:tcW w:type="dxa" w:w="2677"/>
+            <w:tcW w:type="dxa" w:w="2487"/>
             <w:tcBorders>
               <w:top w:val="single" w:color="BFC5CC" w:sz="4"/>
               <w:left w:val="single" w:color="BFC5CC" w:sz="4"/>
@@ -5718,7 +7193,7 @@
         </w:trPr>
         <w:tc>
           <w:tcPr>
-            <w:tcW w:type="dxa" w:w="2601"/>
+            <w:tcW w:type="dxa" w:w="3056"/>
             <w:tcBorders>
               <w:top w:val="single" w:color="BFC5CC" w:sz="4"/>
               <w:left w:val="single" w:color="BFC5CC" w:sz="4"/>
@@ -5745,7 +7220,7 @@
         </w:tc>
         <w:tc>
           <w:tcPr>
-            <w:tcW w:type="dxa" w:w="3748"/>
+            <w:tcW w:type="dxa" w:w="3483"/>
             <w:tcBorders>
               <w:top w:val="single" w:color="BFC5CC" w:sz="4"/>
               <w:left w:val="single" w:color="BFC5CC" w:sz="4"/>
@@ -5772,7 +7247,7 @@
         </w:tc>
         <w:tc>
           <w:tcPr>
-            <w:tcW w:type="dxa" w:w="2677"/>
+            <w:tcW w:type="dxa" w:w="2487"/>
             <w:tcBorders>
               <w:top w:val="single" w:color="BFC5CC" w:sz="4"/>
               <w:left w:val="single" w:color="BFC5CC" w:sz="4"/>
@@ -5804,7 +7279,7 @@
         </w:trPr>
         <w:tc>
           <w:tcPr>
-            <w:tcW w:type="dxa" w:w="2601"/>
+            <w:tcW w:type="dxa" w:w="3056"/>
             <w:tcBorders>
               <w:top w:val="single" w:color="BFC5CC" w:sz="4"/>
               <w:left w:val="single" w:color="BFC5CC" w:sz="4"/>
@@ -5831,7 +7306,7 @@
         </w:tc>
         <w:tc>
           <w:tcPr>
-            <w:tcW w:type="dxa" w:w="3748"/>
+            <w:tcW w:type="dxa" w:w="3483"/>
             <w:tcBorders>
               <w:top w:val="single" w:color="BFC5CC" w:sz="4"/>
               <w:left w:val="single" w:color="BFC5CC" w:sz="4"/>
@@ -5858,7 +7333,7 @@
         </w:tc>
         <w:tc>
           <w:tcPr>
-            <w:tcW w:type="dxa" w:w="2677"/>
+            <w:tcW w:type="dxa" w:w="2487"/>
             <w:tcBorders>
               <w:top w:val="single" w:color="BFC5CC" w:sz="4"/>
               <w:left w:val="single" w:color="BFC5CC" w:sz="4"/>
@@ -5890,7 +7365,7 @@
         </w:trPr>
         <w:tc>
           <w:tcPr>
-            <w:tcW w:type="dxa" w:w="2601"/>
+            <w:tcW w:type="dxa" w:w="3056"/>
             <w:tcBorders>
               <w:top w:val="single" w:color="BFC5CC" w:sz="4"/>
               <w:left w:val="single" w:color="BFC5CC" w:sz="4"/>
@@ -5917,7 +7392,7 @@
         </w:tc>
         <w:tc>
           <w:tcPr>
-            <w:tcW w:type="dxa" w:w="3748"/>
+            <w:tcW w:type="dxa" w:w="3483"/>
             <w:tcBorders>
               <w:top w:val="single" w:color="BFC5CC" w:sz="4"/>
               <w:left w:val="single" w:color="BFC5CC" w:sz="4"/>
@@ -5954,7 +7429,7 @@
         </w:tc>
         <w:tc>
           <w:tcPr>
-            <w:tcW w:type="dxa" w:w="2677"/>
+            <w:tcW w:type="dxa" w:w="2487"/>
             <w:tcBorders>
               <w:top w:val="single" w:color="BFC5CC" w:sz="4"/>
               <w:left w:val="single" w:color="BFC5CC" w:sz="4"/>
@@ -6004,7 +7479,7 @@
         </w:trPr>
         <w:tc>
           <w:tcPr>
-            <w:tcW w:type="dxa" w:w="2601"/>
+            <w:tcW w:type="dxa" w:w="3056"/>
             <w:tcBorders>
               <w:top w:val="single" w:color="BFC5CC" w:sz="4"/>
               <w:left w:val="single" w:color="BFC5CC" w:sz="4"/>
@@ -6031,7 +7506,7 @@
         </w:tc>
         <w:tc>
           <w:tcPr>
-            <w:tcW w:type="dxa" w:w="3748"/>
+            <w:tcW w:type="dxa" w:w="3483"/>
             <w:tcBorders>
               <w:top w:val="single" w:color="BFC5CC" w:sz="4"/>
               <w:left w:val="single" w:color="BFC5CC" w:sz="4"/>
@@ -6058,7 +7533,7 @@
         </w:tc>
         <w:tc>
           <w:tcPr>
-            <w:tcW w:type="dxa" w:w="2677"/>
+            <w:tcW w:type="dxa" w:w="2487"/>
             <w:tcBorders>
               <w:top w:val="single" w:color="BFC5CC" w:sz="4"/>
               <w:left w:val="single" w:color="BFC5CC" w:sz="4"/>
@@ -6124,7 +7599,7 @@
         </w:trPr>
         <w:tc>
           <w:tcPr>
-            <w:tcW w:type="dxa" w:w="2601"/>
+            <w:tcW w:type="dxa" w:w="3056"/>
             <w:tcBorders>
               <w:top w:val="single" w:color="BFC5CC" w:sz="4"/>
               <w:left w:val="single" w:color="BFC5CC" w:sz="4"/>
@@ -6151,7 +7626,7 @@
         </w:tc>
         <w:tc>
           <w:tcPr>
-            <w:tcW w:type="dxa" w:w="3748"/>
+            <w:tcW w:type="dxa" w:w="3483"/>
             <w:tcBorders>
               <w:top w:val="single" w:color="BFC5CC" w:sz="4"/>
               <w:left w:val="single" w:color="BFC5CC" w:sz="4"/>
@@ -6178,7 +7653,7 @@
         </w:tc>
         <w:tc>
           <w:tcPr>
-            <w:tcW w:type="dxa" w:w="2677"/>
+            <w:tcW w:type="dxa" w:w="2487"/>
             <w:tcBorders>
               <w:top w:val="single" w:color="BFC5CC" w:sz="4"/>
               <w:left w:val="single" w:color="BFC5CC" w:sz="4"/>
@@ -6210,7 +7685,7 @@
         </w:trPr>
         <w:tc>
           <w:tcPr>
-            <w:tcW w:type="dxa" w:w="2601"/>
+            <w:tcW w:type="dxa" w:w="3056"/>
             <w:tcBorders>
               <w:top w:val="single" w:color="BFC5CC" w:sz="4"/>
               <w:left w:val="single" w:color="BFC5CC" w:sz="4"/>
@@ -6237,7 +7712,7 @@
         </w:tc>
         <w:tc>
           <w:tcPr>
-            <w:tcW w:type="dxa" w:w="3748"/>
+            <w:tcW w:type="dxa" w:w="3483"/>
             <w:tcBorders>
               <w:top w:val="single" w:color="BFC5CC" w:sz="4"/>
               <w:left w:val="single" w:color="BFC5CC" w:sz="4"/>
@@ -6264,7 +7739,7 @@
         </w:tc>
         <w:tc>
           <w:tcPr>
-            <w:tcW w:type="dxa" w:w="2677"/>
+            <w:tcW w:type="dxa" w:w="2487"/>
             <w:tcBorders>
               <w:top w:val="single" w:color="BFC5CC" w:sz="4"/>
               <w:left w:val="single" w:color="BFC5CC" w:sz="4"/>
@@ -6296,7 +7771,7 @@
         </w:trPr>
         <w:tc>
           <w:tcPr>
-            <w:tcW w:type="dxa" w:w="2601"/>
+            <w:tcW w:type="dxa" w:w="3056"/>
             <w:tcBorders>
               <w:top w:val="single" w:color="BFC5CC" w:sz="4"/>
               <w:left w:val="single" w:color="BFC5CC" w:sz="4"/>
@@ -6323,7 +7798,7 @@
         </w:tc>
         <w:tc>
           <w:tcPr>
-            <w:tcW w:type="dxa" w:w="3748"/>
+            <w:tcW w:type="dxa" w:w="3483"/>
             <w:tcBorders>
               <w:top w:val="single" w:color="BFC5CC" w:sz="4"/>
               <w:left w:val="single" w:color="BFC5CC" w:sz="4"/>
@@ -6350,7 +7825,7 @@
         </w:tc>
         <w:tc>
           <w:tcPr>
-            <w:tcW w:type="dxa" w:w="2677"/>
+            <w:tcW w:type="dxa" w:w="2487"/>
             <w:tcBorders>
               <w:top w:val="single" w:color="BFC5CC" w:sz="4"/>
               <w:left w:val="single" w:color="BFC5CC" w:sz="4"/>
@@ -6382,7 +7857,7 @@
         </w:trPr>
         <w:tc>
           <w:tcPr>
-            <w:tcW w:type="dxa" w:w="2601"/>
+            <w:tcW w:type="dxa" w:w="3056"/>
             <w:tcBorders>
               <w:top w:val="single" w:color="BFC5CC" w:sz="4"/>
               <w:left w:val="single" w:color="BFC5CC" w:sz="4"/>
@@ -6409,7 +7884,7 @@
         </w:tc>
         <w:tc>
           <w:tcPr>
-            <w:tcW w:type="dxa" w:w="3748"/>
+            <w:tcW w:type="dxa" w:w="3483"/>
             <w:tcBorders>
               <w:top w:val="single" w:color="BFC5CC" w:sz="4"/>
               <w:left w:val="single" w:color="BFC5CC" w:sz="4"/>
@@ -6436,7 +7911,7 @@
         </w:tc>
         <w:tc>
           <w:tcPr>
-            <w:tcW w:type="dxa" w:w="2677"/>
+            <w:tcW w:type="dxa" w:w="2487"/>
             <w:tcBorders>
               <w:top w:val="single" w:color="BFC5CC" w:sz="4"/>
               <w:left w:val="single" w:color="BFC5CC" w:sz="4"/>
@@ -6468,7 +7943,7 @@
         </w:trPr>
         <w:tc>
           <w:tcPr>
-            <w:tcW w:type="dxa" w:w="2601"/>
+            <w:tcW w:type="dxa" w:w="3056"/>
             <w:tcBorders>
               <w:top w:val="single" w:color="BFC5CC" w:sz="4"/>
               <w:left w:val="single" w:color="BFC5CC" w:sz="4"/>
@@ -6495,7 +7970,7 @@
         </w:tc>
         <w:tc>
           <w:tcPr>
-            <w:tcW w:type="dxa" w:w="3748"/>
+            <w:tcW w:type="dxa" w:w="3483"/>
             <w:tcBorders>
               <w:top w:val="single" w:color="BFC5CC" w:sz="4"/>
               <w:left w:val="single" w:color="BFC5CC" w:sz="4"/>
@@ -6522,7 +7997,7 @@
         </w:tc>
         <w:tc>
           <w:tcPr>
-            <w:tcW w:type="dxa" w:w="2677"/>
+            <w:tcW w:type="dxa" w:w="2487"/>
             <w:tcBorders>
               <w:top w:val="single" w:color="BFC5CC" w:sz="4"/>
               <w:left w:val="single" w:color="BFC5CC" w:sz="4"/>
@@ -6554,7 +8029,7 @@
         </w:trPr>
         <w:tc>
           <w:tcPr>
-            <w:tcW w:type="dxa" w:w="2601"/>
+            <w:tcW w:type="dxa" w:w="3056"/>
             <w:tcBorders>
               <w:top w:val="single" w:color="BFC5CC" w:sz="4"/>
               <w:left w:val="single" w:color="BFC5CC" w:sz="4"/>
@@ -6581,7 +8056,7 @@
         </w:tc>
         <w:tc>
           <w:tcPr>
-            <w:tcW w:type="dxa" w:w="3748"/>
+            <w:tcW w:type="dxa" w:w="3483"/>
             <w:tcBorders>
               <w:top w:val="single" w:color="BFC5CC" w:sz="4"/>
               <w:left w:val="single" w:color="BFC5CC" w:sz="4"/>
@@ -6608,7 +8083,7 @@
         </w:tc>
         <w:tc>
           <w:tcPr>
-            <w:tcW w:type="dxa" w:w="2677"/>
+            <w:tcW w:type="dxa" w:w="2487"/>
             <w:tcBorders>
               <w:top w:val="single" w:color="BFC5CC" w:sz="4"/>
               <w:left w:val="single" w:color="BFC5CC" w:sz="4"/>
@@ -6640,7 +8115,7 @@
         </w:trPr>
         <w:tc>
           <w:tcPr>
-            <w:tcW w:type="dxa" w:w="2601"/>
+            <w:tcW w:type="dxa" w:w="3056"/>
             <w:tcBorders>
               <w:top w:val="single" w:color="BFC5CC" w:sz="4"/>
               <w:left w:val="single" w:color="BFC5CC" w:sz="4"/>
@@ -6667,7 +8142,7 @@
         </w:tc>
         <w:tc>
           <w:tcPr>
-            <w:tcW w:type="dxa" w:w="3748"/>
+            <w:tcW w:type="dxa" w:w="3483"/>
             <w:tcBorders>
               <w:top w:val="single" w:color="BFC5CC" w:sz="4"/>
               <w:left w:val="single" w:color="BFC5CC" w:sz="4"/>
@@ -6694,7 +8169,7 @@
         </w:tc>
         <w:tc>
           <w:tcPr>
-            <w:tcW w:type="dxa" w:w="2677"/>
+            <w:tcW w:type="dxa" w:w="2487"/>
             <w:tcBorders>
               <w:top w:val="single" w:color="BFC5CC" w:sz="4"/>
               <w:left w:val="single" w:color="BFC5CC" w:sz="4"/>
@@ -6726,7 +8201,7 @@
         </w:trPr>
         <w:tc>
           <w:tcPr>
-            <w:tcW w:type="dxa" w:w="2601"/>
+            <w:tcW w:type="dxa" w:w="3056"/>
             <w:tcBorders>
               <w:top w:val="single" w:color="BFC5CC" w:sz="4"/>
               <w:left w:val="single" w:color="BFC5CC" w:sz="4"/>
@@ -6753,7 +8228,7 @@
         </w:tc>
         <w:tc>
           <w:tcPr>
-            <w:tcW w:type="dxa" w:w="3748"/>
+            <w:tcW w:type="dxa" w:w="3483"/>
             <w:tcBorders>
               <w:top w:val="single" w:color="BFC5CC" w:sz="4"/>
               <w:left w:val="single" w:color="BFC5CC" w:sz="4"/>
@@ -6780,7 +8255,7 @@
         </w:tc>
         <w:tc>
           <w:tcPr>
-            <w:tcW w:type="dxa" w:w="2677"/>
+            <w:tcW w:type="dxa" w:w="2487"/>
             <w:tcBorders>
               <w:top w:val="single" w:color="BFC5CC" w:sz="4"/>
               <w:left w:val="single" w:color="BFC5CC" w:sz="4"/>
@@ -6812,7 +8287,7 @@
         </w:trPr>
         <w:tc>
           <w:tcPr>
-            <w:tcW w:type="dxa" w:w="2601"/>
+            <w:tcW w:type="dxa" w:w="3056"/>
             <w:tcBorders>
               <w:top w:val="single" w:color="BFC5CC" w:sz="4"/>
               <w:left w:val="single" w:color="BFC5CC" w:sz="4"/>
@@ -6839,7 +8314,7 @@
         </w:tc>
         <w:tc>
           <w:tcPr>
-            <w:tcW w:type="dxa" w:w="3748"/>
+            <w:tcW w:type="dxa" w:w="3483"/>
             <w:tcBorders>
               <w:top w:val="single" w:color="BFC5CC" w:sz="4"/>
               <w:left w:val="single" w:color="BFC5CC" w:sz="4"/>
@@ -6866,7 +8341,7 @@
         </w:tc>
         <w:tc>
           <w:tcPr>
-            <w:tcW w:type="dxa" w:w="2677"/>
+            <w:tcW w:type="dxa" w:w="2487"/>
             <w:tcBorders>
               <w:top w:val="single" w:color="BFC5CC" w:sz="4"/>
               <w:left w:val="single" w:color="BFC5CC" w:sz="4"/>
@@ -6888,6 +8363,694 @@
                 <w:szCs w:val="20"/>
               </w:rPr>
               <w:t xml:space="preserve">Corrige la causa y vuelve a calcular</w:t>
+            </w:r>
+          </w:p>
+        </w:tc>
+      </w:tr>
+      <w:tr>
+        <w:trPr>
+          <w:tblHeader w:val="false"/>
+        </w:trPr>
+        <w:tc>
+          <w:tcPr>
+            <w:tcW w:type="dxa" w:w="3056"/>
+            <w:tcBorders>
+              <w:top w:val="single" w:color="BFC5CC" w:sz="4"/>
+              <w:left w:val="single" w:color="BFC5CC" w:sz="4"/>
+              <w:bottom w:val="single" w:color="BFC5CC" w:sz="4"/>
+              <w:right w:val="single" w:color="BFC5CC" w:sz="4"/>
+            </w:tcBorders>
+            <w:tcMar>
+              <w:top w:type="dxa" w:w="60"/>
+              <w:left w:type="dxa" w:w="100"/>
+              <w:bottom w:type="dxa" w:w="60"/>
+              <w:right w:type="dxa" w:w="100"/>
+            </w:tcMar>
+          </w:tcPr>
+          <w:p>
+            <w:r>
+              <w:rPr>
+                <w:rFonts w:ascii="Calibri" w:cs="Calibri" w:eastAsia="Calibri" w:hAnsi="Calibri"/>
+                <w:sz w:val="20"/>
+                <w:szCs w:val="20"/>
+              </w:rPr>
+              <w:t xml:space="preserve">❌ No se publicó / No se calculó: hay superficies activas sin POA vigente</w:t>
+            </w:r>
+          </w:p>
+        </w:tc>
+        <w:tc>
+          <w:tcPr>
+            <w:tcW w:type="dxa" w:w="3483"/>
+            <w:tcBorders>
+              <w:top w:val="single" w:color="BFC5CC" w:sz="4"/>
+              <w:left w:val="single" w:color="BFC5CC" w:sz="4"/>
+              <w:bottom w:val="single" w:color="BFC5CC" w:sz="4"/>
+              <w:right w:val="single" w:color="BFC5CC" w:sz="4"/>
+            </w:tcBorders>
+            <w:tcMar>
+              <w:top w:type="dxa" w:w="60"/>
+              <w:left w:type="dxa" w:w="100"/>
+              <w:bottom w:type="dxa" w:w="60"/>
+              <w:right w:type="dxa" w:w="100"/>
+            </w:tcMar>
+          </w:tcPr>
+          <w:p>
+            <w:r>
+              <w:rPr>
+                <w:rFonts w:ascii="Calibri" w:cs="Calibri" w:eastAsia="Calibri" w:hAnsi="Calibri"/>
+                <w:sz w:val="20"/>
+                <w:szCs w:val="20"/>
+              </w:rPr>
+              <w:t xml:space="preserve">Falta recalcular la POA</w:t>
+            </w:r>
+          </w:p>
+        </w:tc>
+        <w:tc>
+          <w:tcPr>
+            <w:tcW w:type="dxa" w:w="2487"/>
+            <w:tcBorders>
+              <w:top w:val="single" w:color="BFC5CC" w:sz="4"/>
+              <w:left w:val="single" w:color="BFC5CC" w:sz="4"/>
+              <w:bottom w:val="single" w:color="BFC5CC" w:sz="4"/>
+              <w:right w:val="single" w:color="BFC5CC" w:sz="4"/>
+            </w:tcBorders>
+            <w:tcMar>
+              <w:top w:type="dxa" w:w="60"/>
+              <w:left w:type="dxa" w:w="100"/>
+              <w:bottom w:type="dxa" w:w="60"/>
+              <w:right w:type="dxa" w:w="100"/>
+            </w:tcMar>
+          </w:tcPr>
+          <w:p>
+            <w:r>
+              <w:rPr>
+                <w:rFonts w:ascii="Calibri" w:cs="Calibri" w:eastAsia="Calibri" w:hAnsi="Calibri"/>
+                <w:sz w:val="20"/>
+                <w:szCs w:val="20"/>
+              </w:rPr>
+              <w:t xml:space="preserve">Presiona ⚡ Calcular POA para todas las superficies</w:t>
+            </w:r>
+          </w:p>
+        </w:tc>
+      </w:tr>
+      <w:tr>
+        <w:trPr>
+          <w:tblHeader w:val="false"/>
+        </w:trPr>
+        <w:tc>
+          <w:tcPr>
+            <w:tcW w:type="dxa" w:w="3056"/>
+            <w:tcBorders>
+              <w:top w:val="single" w:color="BFC5CC" w:sz="4"/>
+              <w:left w:val="single" w:color="BFC5CC" w:sz="4"/>
+              <w:bottom w:val="single" w:color="BFC5CC" w:sz="4"/>
+              <w:right w:val="single" w:color="BFC5CC" w:sz="4"/>
+            </w:tcBorders>
+            <w:tcMar>
+              <w:top w:type="dxa" w:w="60"/>
+              <w:left w:type="dxa" w:w="100"/>
+              <w:bottom w:type="dxa" w:w="60"/>
+              <w:right w:type="dxa" w:w="100"/>
+            </w:tcMar>
+          </w:tcPr>
+          <w:p>
+            <w:r>
+              <w:rPr>
+                <w:rFonts w:ascii="Calibri" w:cs="Calibri" w:eastAsia="Calibri" w:hAnsi="Calibri"/>
+                <w:sz w:val="20"/>
+                <w:szCs w:val="20"/>
+              </w:rPr>
+              <w:t xml:space="preserve">❌ No se calculó: elige el panel y corrige los strings indicados arriba</w:t>
+            </w:r>
+          </w:p>
+        </w:tc>
+        <w:tc>
+          <w:tcPr>
+            <w:tcW w:type="dxa" w:w="3483"/>
+            <w:tcBorders>
+              <w:top w:val="single" w:color="BFC5CC" w:sz="4"/>
+              <w:left w:val="single" w:color="BFC5CC" w:sz="4"/>
+              <w:bottom w:val="single" w:color="BFC5CC" w:sz="4"/>
+              <w:right w:val="single" w:color="BFC5CC" w:sz="4"/>
+            </w:tcBorders>
+            <w:tcMar>
+              <w:top w:type="dxa" w:w="60"/>
+              <w:left w:type="dxa" w:w="100"/>
+              <w:bottom w:type="dxa" w:w="60"/>
+              <w:right w:type="dxa" w:w="100"/>
+            </w:tcMar>
+          </w:tcPr>
+          <w:p>
+            <w:r>
+              <w:rPr>
+                <w:rFonts w:ascii="Calibri" w:cs="Calibri" w:eastAsia="Calibri" w:hAnsi="Calibri"/>
+                <w:sz w:val="20"/>
+                <w:szCs w:val="20"/>
+              </w:rPr>
+              <w:t xml:space="preserve">Sin panel utilizable o strings sin N serie</w:t>
+            </w:r>
+          </w:p>
+        </w:tc>
+        <w:tc>
+          <w:tcPr>
+            <w:tcW w:type="dxa" w:w="2487"/>
+            <w:tcBorders>
+              <w:top w:val="single" w:color="BFC5CC" w:sz="4"/>
+              <w:left w:val="single" w:color="BFC5CC" w:sz="4"/>
+              <w:bottom w:val="single" w:color="BFC5CC" w:sz="4"/>
+              <w:right w:val="single" w:color="BFC5CC" w:sz="4"/>
+            </w:tcBorders>
+            <w:tcMar>
+              <w:top w:type="dxa" w:w="60"/>
+              <w:left w:type="dxa" w:w="100"/>
+              <w:bottom w:type="dxa" w:w="60"/>
+              <w:right w:type="dxa" w:w="100"/>
+            </w:tcMar>
+          </w:tcPr>
+          <w:p>
+            <w:r>
+              <w:rPr>
+                <w:rFonts w:ascii="Calibri" w:cs="Calibri" w:eastAsia="Calibri" w:hAnsi="Calibri"/>
+                <w:sz w:val="20"/>
+                <w:szCs w:val="20"/>
+              </w:rPr>
+              <w:t xml:space="preserve">Elige un panel y completa N serie/N paralelo en el paso 3</w:t>
+            </w:r>
+          </w:p>
+        </w:tc>
+      </w:tr>
+      <w:tr>
+        <w:trPr>
+          <w:tblHeader w:val="false"/>
+        </w:trPr>
+        <w:tc>
+          <w:tcPr>
+            <w:tcW w:type="dxa" w:w="3056"/>
+            <w:tcBorders>
+              <w:top w:val="single" w:color="BFC5CC" w:sz="4"/>
+              <w:left w:val="single" w:color="BFC5CC" w:sz="4"/>
+              <w:bottom w:val="single" w:color="BFC5CC" w:sz="4"/>
+              <w:right w:val="single" w:color="BFC5CC" w:sz="4"/>
+            </w:tcBorders>
+            <w:tcMar>
+              <w:top w:type="dxa" w:w="60"/>
+              <w:left w:type="dxa" w:w="100"/>
+              <w:bottom w:type="dxa" w:w="60"/>
+              <w:right w:type="dxa" w:w="100"/>
+            </w:tcMar>
+          </w:tcPr>
+          <w:p>
+            <w:r>
+              <w:rPr>
+                <w:rFonts w:ascii="Calibri" w:cs="Calibri" w:eastAsia="Calibri" w:hAnsi="Calibri"/>
+                <w:sz w:val="20"/>
+                <w:szCs w:val="20"/>
+              </w:rPr>
+              <w:t xml:space="preserve">❌ La superficie … no tiene N serie válido y tampoco hay N serie en 📐 Dimensionamiento</w:t>
+            </w:r>
+          </w:p>
+        </w:tc>
+        <w:tc>
+          <w:tcPr>
+            <w:tcW w:type="dxa" w:w="3483"/>
+            <w:tcBorders>
+              <w:top w:val="single" w:color="BFC5CC" w:sz="4"/>
+              <w:left w:val="single" w:color="BFC5CC" w:sz="4"/>
+              <w:bottom w:val="single" w:color="BFC5CC" w:sz="4"/>
+              <w:right w:val="single" w:color="BFC5CC" w:sz="4"/>
+            </w:tcBorders>
+            <w:tcMar>
+              <w:top w:type="dxa" w:w="60"/>
+              <w:left w:type="dxa" w:w="100"/>
+              <w:bottom w:type="dxa" w:w="60"/>
+              <w:right w:type="dxa" w:w="100"/>
+            </w:tcMar>
+          </w:tcPr>
+          <w:p>
+            <w:r>
+              <w:rPr>
+                <w:rFonts w:ascii="Calibri" w:cs="Calibri" w:eastAsia="Calibri" w:hAnsi="Calibri"/>
+                <w:sz w:val="20"/>
+                <w:szCs w:val="20"/>
+              </w:rPr>
+              <w:t xml:space="preserve">No hay de dónde tomar el N serie</w:t>
+            </w:r>
+          </w:p>
+        </w:tc>
+        <w:tc>
+          <w:tcPr>
+            <w:tcW w:type="dxa" w:w="2487"/>
+            <w:tcBorders>
+              <w:top w:val="single" w:color="BFC5CC" w:sz="4"/>
+              <w:left w:val="single" w:color="BFC5CC" w:sz="4"/>
+              <w:bottom w:val="single" w:color="BFC5CC" w:sz="4"/>
+              <w:right w:val="single" w:color="BFC5CC" w:sz="4"/>
+            </w:tcBorders>
+            <w:tcMar>
+              <w:top w:type="dxa" w:w="60"/>
+              <w:left w:type="dxa" w:w="100"/>
+              <w:bottom w:type="dxa" w:w="60"/>
+              <w:right w:type="dxa" w:w="100"/>
+            </w:tcMar>
+          </w:tcPr>
+          <w:p>
+            <w:r>
+              <w:rPr>
+                <w:rFonts w:ascii="Calibri" w:cs="Calibri" w:eastAsia="Calibri" w:hAnsi="Calibri"/>
+                <w:sz w:val="20"/>
+                <w:szCs w:val="20"/>
+              </w:rPr>
+              <w:t xml:space="preserve">Escribe N serie y N paralelo de esa superficie en el paso 3</w:t>
+            </w:r>
+          </w:p>
+        </w:tc>
+      </w:tr>
+      <w:tr>
+        <w:trPr>
+          <w:tblHeader w:val="false"/>
+        </w:trPr>
+        <w:tc>
+          <w:tcPr>
+            <w:tcW w:type="dxa" w:w="3056"/>
+            <w:tcBorders>
+              <w:top w:val="single" w:color="BFC5CC" w:sz="4"/>
+              <w:left w:val="single" w:color="BFC5CC" w:sz="4"/>
+              <w:bottom w:val="single" w:color="BFC5CC" w:sz="4"/>
+              <w:right w:val="single" w:color="BFC5CC" w:sz="4"/>
+            </w:tcBorders>
+            <w:tcMar>
+              <w:top w:type="dxa" w:w="60"/>
+              <w:left w:type="dxa" w:w="100"/>
+              <w:bottom w:type="dxa" w:w="60"/>
+              <w:right w:type="dxa" w:w="100"/>
+            </w:tcMar>
+          </w:tcPr>
+          <w:p>
+            <w:r>
+              <w:rPr>
+                <w:rFonts w:ascii="Calibri" w:cs="Calibri" w:eastAsia="Calibri" w:hAnsi="Calibri"/>
+                <w:sz w:val="20"/>
+                <w:szCs w:val="20"/>
+              </w:rPr>
+              <w:t xml:space="preserve">⚠️ '…': strings por estimación</w:t>
+            </w:r>
+          </w:p>
+        </w:tc>
+        <w:tc>
+          <w:tcPr>
+            <w:tcW w:type="dxa" w:w="3483"/>
+            <w:tcBorders>
+              <w:top w:val="single" w:color="BFC5CC" w:sz="4"/>
+              <w:left w:val="single" w:color="BFC5CC" w:sz="4"/>
+              <w:bottom w:val="single" w:color="BFC5CC" w:sz="4"/>
+              <w:right w:val="single" w:color="BFC5CC" w:sz="4"/>
+            </w:tcBorders>
+            <w:tcMar>
+              <w:top w:type="dxa" w:w="60"/>
+              <w:left w:type="dxa" w:w="100"/>
+              <w:bottom w:type="dxa" w:w="60"/>
+              <w:right w:type="dxa" w:w="100"/>
+            </w:tcMar>
+          </w:tcPr>
+          <w:p>
+            <w:r>
+              <w:rPr>
+                <w:rFonts w:ascii="Calibri" w:cs="Calibri" w:eastAsia="Calibri" w:hAnsi="Calibri"/>
+                <w:sz w:val="20"/>
+                <w:szCs w:val="20"/>
+              </w:rPr>
+              <w:t xml:space="preserve">La superficie no tiene N serie o N paralelo propios</w:t>
+            </w:r>
+          </w:p>
+        </w:tc>
+        <w:tc>
+          <w:tcPr>
+            <w:tcW w:type="dxa" w:w="2487"/>
+            <w:tcBorders>
+              <w:top w:val="single" w:color="BFC5CC" w:sz="4"/>
+              <w:left w:val="single" w:color="BFC5CC" w:sz="4"/>
+              <w:bottom w:val="single" w:color="BFC5CC" w:sz="4"/>
+              <w:right w:val="single" w:color="BFC5CC" w:sz="4"/>
+            </w:tcBorders>
+            <w:tcMar>
+              <w:top w:type="dxa" w:w="60"/>
+              <w:left w:type="dxa" w:w="100"/>
+              <w:bottom w:type="dxa" w:w="60"/>
+              <w:right w:type="dxa" w:w="100"/>
+            </w:tcMar>
+          </w:tcPr>
+          <w:p>
+            <w:r>
+              <w:rPr>
+                <w:rFonts w:ascii="Calibri" w:cs="Calibri" w:eastAsia="Calibri" w:hAnsi="Calibri"/>
+                <w:sz w:val="20"/>
+                <w:szCs w:val="20"/>
+              </w:rPr>
+              <w:t xml:space="preserve">Complétalos en el paso 3 para usar los reales</w:t>
+            </w:r>
+          </w:p>
+        </w:tc>
+      </w:tr>
+      <w:tr>
+        <w:trPr>
+          <w:tblHeader w:val="false"/>
+        </w:trPr>
+        <w:tc>
+          <w:tcPr>
+            <w:tcW w:type="dxa" w:w="3056"/>
+            <w:tcBorders>
+              <w:top w:val="single" w:color="BFC5CC" w:sz="4"/>
+              <w:left w:val="single" w:color="BFC5CC" w:sz="4"/>
+              <w:bottom w:val="single" w:color="BFC5CC" w:sz="4"/>
+              <w:right w:val="single" w:color="BFC5CC" w:sz="4"/>
+            </w:tcBorders>
+            <w:tcMar>
+              <w:top w:type="dxa" w:w="60"/>
+              <w:left w:type="dxa" w:w="100"/>
+              <w:bottom w:type="dxa" w:w="60"/>
+              <w:right w:type="dxa" w:w="100"/>
+            </w:tcMar>
+          </w:tcPr>
+          <w:p>
+            <w:r>
+              <w:rPr>
+                <w:rFonts w:ascii="Calibri" w:cs="Calibri" w:eastAsia="Calibri" w:hAnsi="Calibri"/>
+                <w:sz w:val="20"/>
+                <w:szCs w:val="20"/>
+              </w:rPr>
+              <w:t xml:space="preserve">⚠️ Esta energía se publicó con una versión anterior… (origen desconocido)</w:t>
+            </w:r>
+          </w:p>
+        </w:tc>
+        <w:tc>
+          <w:tcPr>
+            <w:tcW w:type="dxa" w:w="3483"/>
+            <w:tcBorders>
+              <w:top w:val="single" w:color="BFC5CC" w:sz="4"/>
+              <w:left w:val="single" w:color="BFC5CC" w:sz="4"/>
+              <w:bottom w:val="single" w:color="BFC5CC" w:sz="4"/>
+              <w:right w:val="single" w:color="BFC5CC" w:sz="4"/>
+            </w:tcBorders>
+            <w:tcMar>
+              <w:top w:type="dxa" w:w="60"/>
+              <w:left w:type="dxa" w:w="100"/>
+              <w:bottom w:type="dxa" w:w="60"/>
+              <w:right w:type="dxa" w:w="100"/>
+            </w:tcMar>
+          </w:tcPr>
+          <w:p>
+            <w:r>
+              <w:rPr>
+                <w:rFonts w:ascii="Calibri" w:cs="Calibri" w:eastAsia="Calibri" w:hAnsi="Calibri"/>
+                <w:sz w:val="20"/>
+                <w:szCs w:val="20"/>
+              </w:rPr>
+              <w:t xml:space="preserve">Energía de antes del 24-sep-2026</w:t>
+            </w:r>
+          </w:p>
+        </w:tc>
+        <w:tc>
+          <w:tcPr>
+            <w:tcW w:type="dxa" w:w="2487"/>
+            <w:tcBorders>
+              <w:top w:val="single" w:color="BFC5CC" w:sz="4"/>
+              <w:left w:val="single" w:color="BFC5CC" w:sz="4"/>
+              <w:bottom w:val="single" w:color="BFC5CC" w:sz="4"/>
+              <w:right w:val="single" w:color="BFC5CC" w:sz="4"/>
+            </w:tcBorders>
+            <w:tcMar>
+              <w:top w:type="dxa" w:w="60"/>
+              <w:left w:type="dxa" w:w="100"/>
+              <w:bottom w:type="dxa" w:w="60"/>
+              <w:right w:type="dxa" w:w="100"/>
+            </w:tcMar>
+          </w:tcPr>
+          <w:p>
+            <w:r>
+              <w:rPr>
+                <w:rFonts w:ascii="Calibri" w:cs="Calibri" w:eastAsia="Calibri" w:hAnsi="Calibri"/>
+                <w:sz w:val="20"/>
+                <w:szCs w:val="20"/>
+              </w:rPr>
+              <w:t xml:space="preserve">Vuelve a publicarla antes de guardar</w:t>
+            </w:r>
+          </w:p>
+        </w:tc>
+      </w:tr>
+      <w:tr>
+        <w:trPr>
+          <w:tblHeader w:val="false"/>
+        </w:trPr>
+        <w:tc>
+          <w:tcPr>
+            <w:tcW w:type="dxa" w:w="3056"/>
+            <w:tcBorders>
+              <w:top w:val="single" w:color="BFC5CC" w:sz="4"/>
+              <w:left w:val="single" w:color="BFC5CC" w:sz="4"/>
+              <w:bottom w:val="single" w:color="BFC5CC" w:sz="4"/>
+              <w:right w:val="single" w:color="BFC5CC" w:sz="4"/>
+            </w:tcBorders>
+            <w:tcMar>
+              <w:top w:type="dxa" w:w="60"/>
+              <w:left w:type="dxa" w:w="100"/>
+              <w:bottom w:type="dxa" w:w="60"/>
+              <w:right w:type="dxa" w:w="100"/>
+            </w:tcMar>
+          </w:tcPr>
+          <w:p>
+            <w:r>
+              <w:rPr>
+                <w:rFonts w:ascii="Calibri" w:cs="Calibri" w:eastAsia="Calibri" w:hAnsi="Calibri"/>
+                <w:sz w:val="20"/>
+                <w:szCs w:val="20"/>
+              </w:rPr>
+              <w:t xml:space="preserve">⚠️ Se descartaron los puntos de «…»: esa superficie ya no existe</w:t>
+            </w:r>
+          </w:p>
+        </w:tc>
+        <w:tc>
+          <w:tcPr>
+            <w:tcW w:type="dxa" w:w="3483"/>
+            <w:tcBorders>
+              <w:top w:val="single" w:color="BFC5CC" w:sz="4"/>
+              <w:left w:val="single" w:color="BFC5CC" w:sz="4"/>
+              <w:bottom w:val="single" w:color="BFC5CC" w:sz="4"/>
+              <w:right w:val="single" w:color="BFC5CC" w:sz="4"/>
+            </w:tcBorders>
+            <w:tcMar>
+              <w:top w:type="dxa" w:w="60"/>
+              <w:left w:type="dxa" w:w="100"/>
+              <w:bottom w:type="dxa" w:w="60"/>
+              <w:right w:type="dxa" w:w="100"/>
+            </w:tcMar>
+          </w:tcPr>
+          <w:p>
+            <w:r>
+              <w:rPr>
+                <w:rFonts w:ascii="Calibri" w:cs="Calibri" w:eastAsia="Calibri" w:hAnsi="Calibri"/>
+                <w:sz w:val="20"/>
+                <w:szCs w:val="20"/>
+              </w:rPr>
+              <w:t xml:space="preserve">Puntos de una superficie eliminada</w:t>
+            </w:r>
+          </w:p>
+        </w:tc>
+        <w:tc>
+          <w:tcPr>
+            <w:tcW w:type="dxa" w:w="2487"/>
+            <w:tcBorders>
+              <w:top w:val="single" w:color="BFC5CC" w:sz="4"/>
+              <w:left w:val="single" w:color="BFC5CC" w:sz="4"/>
+              <w:bottom w:val="single" w:color="BFC5CC" w:sz="4"/>
+              <w:right w:val="single" w:color="BFC5CC" w:sz="4"/>
+            </w:tcBorders>
+            <w:tcMar>
+              <w:top w:type="dxa" w:w="60"/>
+              <w:left w:type="dxa" w:w="100"/>
+              <w:bottom w:type="dxa" w:w="60"/>
+              <w:right w:type="dxa" w:w="100"/>
+            </w:tcMar>
+          </w:tcPr>
+          <w:p>
+            <w:r>
+              <w:rPr>
+                <w:rFonts w:ascii="Calibri" w:cs="Calibri" w:eastAsia="Calibri" w:hAnsi="Calibri"/>
+                <w:sz w:val="20"/>
+                <w:szCs w:val="20"/>
+              </w:rPr>
+              <w:t xml:space="preserve">Ninguna acción; escribe los puntos de las superficies actuales</w:t>
+            </w:r>
+          </w:p>
+        </w:tc>
+      </w:tr>
+      <w:tr>
+        <w:trPr>
+          <w:tblHeader w:val="false"/>
+        </w:trPr>
+        <w:tc>
+          <w:tcPr>
+            <w:tcW w:type="dxa" w:w="3056"/>
+            <w:tcBorders>
+              <w:top w:val="single" w:color="BFC5CC" w:sz="4"/>
+              <w:left w:val="single" w:color="BFC5CC" w:sz="4"/>
+              <w:bottom w:val="single" w:color="BFC5CC" w:sz="4"/>
+              <w:right w:val="single" w:color="BFC5CC" w:sz="4"/>
+            </w:tcBorders>
+            <w:tcMar>
+              <w:top w:type="dxa" w:w="60"/>
+              <w:left w:type="dxa" w:w="100"/>
+              <w:bottom w:type="dxa" w:w="60"/>
+              <w:right w:type="dxa" w:w="100"/>
+            </w:tcMar>
+          </w:tcPr>
+          <w:p>
+            <w:r>
+              <w:rPr>
+                <w:rFonts w:ascii="Calibri" w:cs="Calibri" w:eastAsia="Calibri" w:hAnsi="Calibri"/>
+                <w:sz w:val="20"/>
+                <w:szCs w:val="20"/>
+              </w:rPr>
+              <w:t xml:space="preserve">Para calcular la sombra: …</w:t>
+            </w:r>
+          </w:p>
+        </w:tc>
+        <w:tc>
+          <w:tcPr>
+            <w:tcW w:type="dxa" w:w="3483"/>
+            <w:tcBorders>
+              <w:top w:val="single" w:color="BFC5CC" w:sz="4"/>
+              <w:left w:val="single" w:color="BFC5CC" w:sz="4"/>
+              <w:bottom w:val="single" w:color="BFC5CC" w:sz="4"/>
+              <w:right w:val="single" w:color="BFC5CC" w:sz="4"/>
+            </w:tcBorders>
+            <w:tcMar>
+              <w:top w:type="dxa" w:w="60"/>
+              <w:left w:type="dxa" w:w="100"/>
+              <w:bottom w:type="dxa" w:w="60"/>
+              <w:right w:type="dxa" w:w="100"/>
+            </w:tcMar>
+          </w:tcPr>
+          <w:p>
+            <w:r>
+              <w:rPr>
+                <w:rFonts w:ascii="Calibri" w:cs="Calibri" w:eastAsia="Calibri" w:hAnsi="Calibri"/>
+                <w:sz w:val="20"/>
+                <w:szCs w:val="20"/>
+              </w:rPr>
+              <w:t xml:space="preserve">Falta escena, TMY, corregir líneas o puntos</w:t>
+            </w:r>
+          </w:p>
+        </w:tc>
+        <w:tc>
+          <w:tcPr>
+            <w:tcW w:type="dxa" w:w="2487"/>
+            <w:tcBorders>
+              <w:top w:val="single" w:color="BFC5CC" w:sz="4"/>
+              <w:left w:val="single" w:color="BFC5CC" w:sz="4"/>
+              <w:bottom w:val="single" w:color="BFC5CC" w:sz="4"/>
+              <w:right w:val="single" w:color="BFC5CC" w:sz="4"/>
+            </w:tcBorders>
+            <w:tcMar>
+              <w:top w:type="dxa" w:w="60"/>
+              <w:left w:type="dxa" w:w="100"/>
+              <w:bottom w:type="dxa" w:w="60"/>
+              <w:right w:type="dxa" w:w="100"/>
+            </w:tcMar>
+          </w:tcPr>
+          <w:p>
+            <w:r>
+              <w:rPr>
+                <w:rFonts w:ascii="Calibri" w:cs="Calibri" w:eastAsia="Calibri" w:hAnsi="Calibri"/>
+                <w:sz w:val="20"/>
+                <w:szCs w:val="20"/>
+              </w:rPr>
+              <w:t xml:space="preserve">Haz lo que indica el aviso</w:t>
+            </w:r>
+          </w:p>
+        </w:tc>
+      </w:tr>
+      <w:tr>
+        <w:trPr>
+          <w:tblHeader w:val="false"/>
+        </w:trPr>
+        <w:tc>
+          <w:tcPr>
+            <w:tcW w:type="dxa" w:w="3056"/>
+            <w:tcBorders>
+              <w:top w:val="single" w:color="BFC5CC" w:sz="4"/>
+              <w:left w:val="single" w:color="BFC5CC" w:sz="4"/>
+              <w:bottom w:val="single" w:color="BFC5CC" w:sz="4"/>
+              <w:right w:val="single" w:color="BFC5CC" w:sz="4"/>
+            </w:tcBorders>
+            <w:tcMar>
+              <w:top w:type="dxa" w:w="60"/>
+              <w:left w:type="dxa" w:w="100"/>
+              <w:bottom w:type="dxa" w:w="60"/>
+              <w:right w:type="dxa" w:w="100"/>
+            </w:tcMar>
+          </w:tcPr>
+          <w:p>
+            <w:r>
+              <w:rPr>
+                <w:rFonts w:ascii="Calibri" w:cs="Calibri" w:eastAsia="Calibri" w:hAnsi="Calibri"/>
+                <w:sz w:val="20"/>
+                <w:szCs w:val="20"/>
+              </w:rPr>
+              <w:t xml:space="preserve">📂 Estado multi-superficie rechazado…</w:t>
+            </w:r>
+          </w:p>
+        </w:tc>
+        <w:tc>
+          <w:tcPr>
+            <w:tcW w:type="dxa" w:w="3483"/>
+            <w:tcBorders>
+              <w:top w:val="single" w:color="BFC5CC" w:sz="4"/>
+              <w:left w:val="single" w:color="BFC5CC" w:sz="4"/>
+              <w:bottom w:val="single" w:color="BFC5CC" w:sz="4"/>
+              <w:right w:val="single" w:color="BFC5CC" w:sz="4"/>
+            </w:tcBorders>
+            <w:tcMar>
+              <w:top w:type="dxa" w:w="60"/>
+              <w:left w:type="dxa" w:w="100"/>
+              <w:bottom w:type="dxa" w:w="60"/>
+              <w:right w:type="dxa" w:w="100"/>
+            </w:tcMar>
+          </w:tcPr>
+          <w:p>
+            <w:r>
+              <w:rPr>
+                <w:rFonts w:ascii="Calibri" w:cs="Calibri" w:eastAsia="Calibri" w:hAnsi="Calibri"/>
+                <w:sz w:val="20"/>
+                <w:szCs w:val="20"/>
+              </w:rPr>
+              <w:t xml:space="preserve">El TMY o las firmas del proyecto guardado no coinciden</w:t>
+            </w:r>
+          </w:p>
+        </w:tc>
+        <w:tc>
+          <w:tcPr>
+            <w:tcW w:type="dxa" w:w="2487"/>
+            <w:tcBorders>
+              <w:top w:val="single" w:color="BFC5CC" w:sz="4"/>
+              <w:left w:val="single" w:color="BFC5CC" w:sz="4"/>
+              <w:bottom w:val="single" w:color="BFC5CC" w:sz="4"/>
+              <w:right w:val="single" w:color="BFC5CC" w:sz="4"/>
+            </w:tcBorders>
+            <w:tcMar>
+              <w:top w:type="dxa" w:w="60"/>
+              <w:left w:type="dxa" w:w="100"/>
+              <w:bottom w:type="dxa" w:w="60"/>
+              <w:right w:type="dxa" w:w="100"/>
+            </w:tcMar>
+          </w:tcPr>
+          <w:p>
+            <w:r>
+              <w:rPr>
+                <w:rFonts w:ascii="Calibri" w:cs="Calibri" w:eastAsia="Calibri" w:hAnsi="Calibri"/>
+                <w:sz w:val="20"/>
+                <w:szCs w:val="20"/>
+              </w:rPr>
+              <w:t xml:space="preserve">Recalcula POA, sombra y vuelve a publicar</w:t>
             </w:r>
           </w:p>
         </w:tc>

</xml_diff>

<commit_message>
Vista 3D: origen y «Desactivar» también en la sección del bypass
El banner con el origen de la energía y «✖ Desactivar» está en ⚙️ Superficies
BIPV; desde el bypass (📊 Producción por Superficie) no se veía. Ahora el
mensaje «✅ Activo en Financiero» indica el origen y trae su propio botón
«✖ Desactivar modo multi-superficie», que usa la misma retirada central.
Manual, Word y Asistente actualizados.

Co-Authored-By: Claude Opus 5.5 <noreply@anthropic.com>
Claude-Session: https://claude.ai/code/session_01J652KVwAx7nCc91Dn42CnM
</commit_message>
<xml_diff>
--- a/entregables/MANUAL_VISTA_3D_BIPV.docx
+++ b/entregables/MANUAL_VISTA_3D_BIPV.docx
@@ -5974,21 +5974,64 @@
         <w:rPr>
           <w:rFonts w:ascii="Calibri" w:cs="Calibri" w:eastAsia="Calibri" w:hAnsi="Calibri"/>
         </w:rPr>
-        <w:t xml:space="preserve">; si la energía vigente es de otro origen, pide confirmación (ver paso 5). La tabla dice </w:t>
-      </w:r>
-      <w:r>
-        <w:rPr>
-          <w:rFonts w:ascii="Calibri" w:cs="Calibri" w:eastAsia="Calibri" w:hAnsi="Calibri"/>
-          <w:b/>
-          <w:bCs/>
-        </w:rPr>
-        <w:t xml:space="preserve">✅ Activo en Financiero</w:t>
-      </w:r>
-      <w:r>
-        <w:rPr>
-          <w:rFonts w:ascii="Calibri" w:cs="Calibri" w:eastAsia="Calibri" w:hAnsi="Calibri"/>
-        </w:rPr>
-        <w:t xml:space="preserve"> solo cuando su origen es el vigente.</w:t>
+        <w:t xml:space="preserve">; si la energía vigente es de otro origen, pide confirmación (ver paso 5).</w:t>
+      </w:r>
+    </w:p>
+    <w:p>
+      <w:pPr>
+        <w:pStyle w:val="ListParagraph"/>
+        <w:numPr>
+          <w:ilvl w:val="1"/>
+          <w:numId w:val="3"/>
+        </w:numPr>
+      </w:pPr>
+      <w:r>
+        <w:rPr>
+          <w:rFonts w:ascii="Calibri" w:cs="Calibri" w:eastAsia="Calibri" w:hAnsi="Calibri"/>
+        </w:rPr>
+        <w:t xml:space="preserve">Bajo la tabla, cuando su origen es el vigente, dice </w:t>
+      </w:r>
+      <w:r>
+        <w:rPr>
+          <w:rFonts w:ascii="Calibri" w:cs="Calibri" w:eastAsia="Calibri" w:hAnsi="Calibri"/>
+          <w:b/>
+          <w:bCs/>
+        </w:rPr>
+        <w:t xml:space="preserve">✅ Activo en Financiero · Baterías · CO₂ — origen: bypass por superficie con CSV de sombreado</w:t>
+      </w:r>
+      <w:r>
+        <w:rPr>
+          <w:rFonts w:ascii="Calibri" w:cs="Calibri" w:eastAsia="Calibri" w:hAnsi="Calibri"/>
+        </w:rPr>
+        <w:t xml:space="preserve"> y trae el botón </w:t>
+      </w:r>
+      <w:r>
+        <w:rPr>
+          <w:rFonts w:ascii="Calibri" w:cs="Calibri" w:eastAsia="Calibri" w:hAnsi="Calibri"/>
+          <w:b/>
+          <w:bCs/>
+        </w:rPr>
+        <w:t xml:space="preserve">✖ Desactivar modo multi-superficie</w:t>
+      </w:r>
+      <w:r>
+        <w:rPr>
+          <w:rFonts w:ascii="Calibri" w:cs="Calibri" w:eastAsia="Calibri" w:hAnsi="Calibri"/>
+        </w:rPr>
+        <w:t xml:space="preserve">, el mismo del banner de ⚙️ Superficies BIPV. Si la energía vigente es de otro origen, dice </w:t>
+      </w:r>
+      <w:r>
+        <w:rPr>
+          <w:rFonts w:ascii="Calibri" w:cs="Calibri" w:eastAsia="Calibri" w:hAnsi="Calibri"/>
+          <w:i/>
+          <w:iCs/>
+        </w:rPr>
+        <w:t xml:space="preserve">Resultado calculado, no publicado</w:t>
+      </w:r>
+      <w:r>
+        <w:rPr>
+          <w:rFonts w:ascii="Calibri" w:cs="Calibri" w:eastAsia="Calibri" w:hAnsi="Calibri"/>
+        </w:rPr>
+        <w:t xml:space="preserve"> y el origen vigente.</w:t>
       </w:r>
     </w:p>
     <w:p>

</xml_diff>

<commit_message>
Vista 3D: editor de superficies estable y formato único de strings
- Los campos del editor de superficies (nombre, tipo, tilt, azimuth, área,
  activa, montaje) ya no reciben value=/index= desde el dato guardado: en
  Streamlit 1.36 la identidad del widget incluye ese valor, y el campo se
  recreaba en cada edición (el azimuth tardaba o volvía al valor anterior).
  El estado se inicializa una vez y se resincroniza solo si el dato cambió
  fuera del campo (p. ej. al cargar un proyecto). El tilt se ajusta al rango
  del tipo elegido y el encabezado usa los valores actuales.
- Strings con formato único «8 serie × 17 paralelo» en las leyendas y tablas
  del bypass y del MPPT (antes «17×8s» y «8 × 17»).
- Manual, Word y Asistente actualizados.

Co-Authored-By: Claude Opus 5.5 <noreply@anthropic.com>
Claude-Session: https://claude.ai/code/session_01J652KVwAx7nCc91Dn42CnM
</commit_message>
<xml_diff>
--- a/entregables/MANUAL_VISTA_3D_BIPV.docx
+++ b/entregables/MANUAL_VISTA_3D_BIPV.docx
@@ -109,8 +109,8 @@
       </w:tblPr>
       <w:tblGrid>
         <w:gridCol w:w="1100"/>
-        <w:gridCol w:w="5473"/>
-        <w:gridCol w:w="2453"/>
+        <w:gridCol w:w="4661"/>
+        <w:gridCol w:w="3265"/>
       </w:tblGrid>
       <w:tr>
         <w:trPr>
@@ -149,7 +149,7 @@
         </w:tc>
         <w:tc>
           <w:tcPr>
-            <w:tcW w:type="dxa" w:w="5473"/>
+            <w:tcW w:type="dxa" w:w="4661"/>
             <w:tcBorders>
               <w:top w:val="single" w:color="BFC5CC" w:sz="4"/>
               <w:left w:val="single" w:color="BFC5CC" w:sz="4"/>
@@ -180,7 +180,7 @@
         </w:tc>
         <w:tc>
           <w:tcPr>
-            <w:tcW w:type="dxa" w:w="2453"/>
+            <w:tcW w:type="dxa" w:w="3265"/>
             <w:tcBorders>
               <w:top w:val="single" w:color="BFC5CC" w:sz="4"/>
               <w:left w:val="single" w:color="BFC5CC" w:sz="4"/>
@@ -245,7 +245,7 @@
         </w:tc>
         <w:tc>
           <w:tcPr>
-            <w:tcW w:type="dxa" w:w="5473"/>
+            <w:tcW w:type="dxa" w:w="4661"/>
             <w:tcBorders>
               <w:top w:val="single" w:color="BFC5CC" w:sz="4"/>
               <w:left w:val="single" w:color="BFC5CC" w:sz="4"/>
@@ -290,7 +290,7 @@
         </w:tc>
         <w:tc>
           <w:tcPr>
-            <w:tcW w:type="dxa" w:w="2453"/>
+            <w:tcW w:type="dxa" w:w="3265"/>
             <w:tcBorders>
               <w:top w:val="single" w:color="BFC5CC" w:sz="4"/>
               <w:left w:val="single" w:color="BFC5CC" w:sz="4"/>
@@ -351,7 +351,7 @@
         </w:tc>
         <w:tc>
           <w:tcPr>
-            <w:tcW w:type="dxa" w:w="5473"/>
+            <w:tcW w:type="dxa" w:w="4661"/>
             <w:tcBorders>
               <w:top w:val="single" w:color="BFC5CC" w:sz="4"/>
               <w:left w:val="single" w:color="BFC5CC" w:sz="4"/>
@@ -406,7 +406,7 @@
         </w:tc>
         <w:tc>
           <w:tcPr>
-            <w:tcW w:type="dxa" w:w="2453"/>
+            <w:tcW w:type="dxa" w:w="3265"/>
             <w:tcBorders>
               <w:top w:val="single" w:color="BFC5CC" w:sz="4"/>
               <w:left w:val="single" w:color="BFC5CC" w:sz="4"/>
@@ -467,7 +467,7 @@
         </w:tc>
         <w:tc>
           <w:tcPr>
-            <w:tcW w:type="dxa" w:w="5473"/>
+            <w:tcW w:type="dxa" w:w="4661"/>
             <w:tcBorders>
               <w:top w:val="single" w:color="BFC5CC" w:sz="4"/>
               <w:left w:val="single" w:color="BFC5CC" w:sz="4"/>
@@ -528,7 +528,7 @@
         </w:tc>
         <w:tc>
           <w:tcPr>
-            <w:tcW w:type="dxa" w:w="2453"/>
+            <w:tcW w:type="dxa" w:w="3265"/>
             <w:tcBorders>
               <w:top w:val="single" w:color="BFC5CC" w:sz="4"/>
               <w:left w:val="single" w:color="BFC5CC" w:sz="4"/>
@@ -589,7 +589,7 @@
         </w:tc>
         <w:tc>
           <w:tcPr>
-            <w:tcW w:type="dxa" w:w="5473"/>
+            <w:tcW w:type="dxa" w:w="4661"/>
             <w:tcBorders>
               <w:top w:val="single" w:color="BFC5CC" w:sz="4"/>
               <w:left w:val="single" w:color="BFC5CC" w:sz="4"/>
@@ -634,7 +634,7 @@
         </w:tc>
         <w:tc>
           <w:tcPr>
-            <w:tcW w:type="dxa" w:w="2453"/>
+            <w:tcW w:type="dxa" w:w="3265"/>
             <w:tcBorders>
               <w:top w:val="single" w:color="BFC5CC" w:sz="4"/>
               <w:left w:val="single" w:color="BFC5CC" w:sz="4"/>
@@ -713,7 +713,7 @@
         </w:tc>
         <w:tc>
           <w:tcPr>
-            <w:tcW w:type="dxa" w:w="5473"/>
+            <w:tcW w:type="dxa" w:w="4661"/>
             <w:tcBorders>
               <w:top w:val="single" w:color="BFC5CC" w:sz="4"/>
               <w:left w:val="single" w:color="BFC5CC" w:sz="4"/>
@@ -758,7 +758,7 @@
         </w:tc>
         <w:tc>
           <w:tcPr>
-            <w:tcW w:type="dxa" w:w="2453"/>
+            <w:tcW w:type="dxa" w:w="3265"/>
             <w:tcBorders>
               <w:top w:val="single" w:color="BFC5CC" w:sz="4"/>
               <w:left w:val="single" w:color="BFC5CC" w:sz="4"/>
@@ -837,7 +837,7 @@
         </w:tc>
         <w:tc>
           <w:tcPr>
-            <w:tcW w:type="dxa" w:w="5473"/>
+            <w:tcW w:type="dxa" w:w="4661"/>
             <w:tcBorders>
               <w:top w:val="single" w:color="BFC5CC" w:sz="4"/>
               <w:left w:val="single" w:color="BFC5CC" w:sz="4"/>
@@ -864,7 +864,7 @@
         </w:tc>
         <w:tc>
           <w:tcPr>
-            <w:tcW w:type="dxa" w:w="2453"/>
+            <w:tcW w:type="dxa" w:w="3265"/>
             <w:tcBorders>
               <w:top w:val="single" w:color="BFC5CC" w:sz="4"/>
               <w:left w:val="single" w:color="BFC5CC" w:sz="4"/>
@@ -925,7 +925,7 @@
         </w:tc>
         <w:tc>
           <w:tcPr>
-            <w:tcW w:type="dxa" w:w="5473"/>
+            <w:tcW w:type="dxa" w:w="4661"/>
             <w:tcBorders>
               <w:top w:val="single" w:color="BFC5CC" w:sz="4"/>
               <w:left w:val="single" w:color="BFC5CC" w:sz="4"/>
@@ -952,7 +952,7 @@
         </w:tc>
         <w:tc>
           <w:tcPr>
-            <w:tcW w:type="dxa" w:w="2453"/>
+            <w:tcW w:type="dxa" w:w="3265"/>
             <w:tcBorders>
               <w:top w:val="single" w:color="BFC5CC" w:sz="4"/>
               <w:left w:val="single" w:color="BFC5CC" w:sz="4"/>
@@ -974,6 +974,182 @@
                 <w:szCs w:val="20"/>
               </w:rPr>
               <w:t xml:space="preserve">Se contaba sombra total en esas horas</w:t>
+            </w:r>
+          </w:p>
+        </w:tc>
+      </w:tr>
+      <w:tr>
+        <w:trPr>
+          <w:tblHeader w:val="false"/>
+        </w:trPr>
+        <w:tc>
+          <w:tcPr>
+            <w:tcW w:type="dxa" w:w="1100"/>
+            <w:tcBorders>
+              <w:top w:val="single" w:color="BFC5CC" w:sz="4"/>
+              <w:left w:val="single" w:color="BFC5CC" w:sz="4"/>
+              <w:bottom w:val="single" w:color="BFC5CC" w:sz="4"/>
+              <w:right w:val="single" w:color="BFC5CC" w:sz="4"/>
+            </w:tcBorders>
+            <w:tcMar>
+              <w:top w:type="dxa" w:w="60"/>
+              <w:left w:type="dxa" w:w="100"/>
+              <w:bottom w:type="dxa" w:w="60"/>
+              <w:right w:type="dxa" w:w="100"/>
+            </w:tcMar>
+          </w:tcPr>
+          <w:p>
+            <w:r>
+              <w:rPr>
+                <w:rFonts w:ascii="Calibri" w:cs="Calibri" w:eastAsia="Calibri" w:hAnsi="Calibri"/>
+                <w:b/>
+                <w:bCs/>
+                <w:sz w:val="20"/>
+                <w:szCs w:val="20"/>
+              </w:rPr>
+              <w:t xml:space="preserve">Formato de strings</w:t>
+            </w:r>
+          </w:p>
+        </w:tc>
+        <w:tc>
+          <w:tcPr>
+            <w:tcW w:type="dxa" w:w="4661"/>
+            <w:tcBorders>
+              <w:top w:val="single" w:color="BFC5CC" w:sz="4"/>
+              <w:left w:val="single" w:color="BFC5CC" w:sz="4"/>
+              <w:bottom w:val="single" w:color="BFC5CC" w:sz="4"/>
+              <w:right w:val="single" w:color="BFC5CC" w:sz="4"/>
+            </w:tcBorders>
+            <w:tcMar>
+              <w:top w:type="dxa" w:w="60"/>
+              <w:left w:type="dxa" w:w="100"/>
+              <w:bottom w:type="dxa" w:w="60"/>
+              <w:right w:type="dxa" w:w="100"/>
+            </w:tcMar>
+          </w:tcPr>
+          <w:p>
+            <w:r>
+              <w:rPr>
+                <w:rFonts w:ascii="Calibri" w:cs="Calibri" w:eastAsia="Calibri" w:hAnsi="Calibri"/>
+                <w:sz w:val="20"/>
+                <w:szCs w:val="20"/>
+              </w:rPr>
+              <w:t xml:space="preserve">Leyendas y tablas del bypass y del MPPT dicen siempre «8 serie × 17 paralelo»</w:t>
+            </w:r>
+          </w:p>
+        </w:tc>
+        <w:tc>
+          <w:tcPr>
+            <w:tcW w:type="dxa" w:w="3265"/>
+            <w:tcBorders>
+              <w:top w:val="single" w:color="BFC5CC" w:sz="4"/>
+              <w:left w:val="single" w:color="BFC5CC" w:sz="4"/>
+              <w:bottom w:val="single" w:color="BFC5CC" w:sz="4"/>
+              <w:right w:val="single" w:color="BFC5CC" w:sz="4"/>
+            </w:tcBorders>
+            <w:tcMar>
+              <w:top w:type="dxa" w:w="60"/>
+              <w:left w:type="dxa" w:w="100"/>
+              <w:bottom w:type="dxa" w:w="60"/>
+              <w:right w:type="dxa" w:w="100"/>
+            </w:tcMar>
+          </w:tcPr>
+          <w:p>
+            <w:r>
+              <w:rPr>
+                <w:rFonts w:ascii="Calibri" w:cs="Calibri" w:eastAsia="Calibri" w:hAnsi="Calibri"/>
+                <w:sz w:val="20"/>
+                <w:szCs w:val="20"/>
+              </w:rPr>
+              <w:t xml:space="preserve">La leyenda decía «17×8s» y la tabla «8 × 17»</w:t>
+            </w:r>
+          </w:p>
+        </w:tc>
+      </w:tr>
+      <w:tr>
+        <w:trPr>
+          <w:tblHeader w:val="false"/>
+        </w:trPr>
+        <w:tc>
+          <w:tcPr>
+            <w:tcW w:type="dxa" w:w="1100"/>
+            <w:tcBorders>
+              <w:top w:val="single" w:color="BFC5CC" w:sz="4"/>
+              <w:left w:val="single" w:color="BFC5CC" w:sz="4"/>
+              <w:bottom w:val="single" w:color="BFC5CC" w:sz="4"/>
+              <w:right w:val="single" w:color="BFC5CC" w:sz="4"/>
+            </w:tcBorders>
+            <w:tcMar>
+              <w:top w:type="dxa" w:w="60"/>
+              <w:left w:type="dxa" w:w="100"/>
+              <w:bottom w:type="dxa" w:w="60"/>
+              <w:right w:type="dxa" w:w="100"/>
+            </w:tcMar>
+          </w:tcPr>
+          <w:p>
+            <w:r>
+              <w:rPr>
+                <w:rFonts w:ascii="Calibri" w:cs="Calibri" w:eastAsia="Calibri" w:hAnsi="Calibri"/>
+                <w:b/>
+                <w:bCs/>
+                <w:sz w:val="20"/>
+                <w:szCs w:val="20"/>
+              </w:rPr>
+              <w:t xml:space="preserve">Editor de superficies</w:t>
+            </w:r>
+          </w:p>
+        </w:tc>
+        <w:tc>
+          <w:tcPr>
+            <w:tcW w:type="dxa" w:w="4661"/>
+            <w:tcBorders>
+              <w:top w:val="single" w:color="BFC5CC" w:sz="4"/>
+              <w:left w:val="single" w:color="BFC5CC" w:sz="4"/>
+              <w:bottom w:val="single" w:color="BFC5CC" w:sz="4"/>
+              <w:right w:val="single" w:color="BFC5CC" w:sz="4"/>
+            </w:tcBorders>
+            <w:tcMar>
+              <w:top w:type="dxa" w:w="60"/>
+              <w:left w:type="dxa" w:w="100"/>
+              <w:bottom w:type="dxa" w:w="60"/>
+              <w:right w:type="dxa" w:w="100"/>
+            </w:tcMar>
+          </w:tcPr>
+          <w:p>
+            <w:r>
+              <w:rPr>
+                <w:rFonts w:ascii="Calibri" w:cs="Calibri" w:eastAsia="Calibri" w:hAnsi="Calibri"/>
+                <w:sz w:val="20"/>
+                <w:szCs w:val="20"/>
+              </w:rPr>
+              <w:t xml:space="preserve">Tilt, azimuth, área, nombre, tipo, montaje y «Activa» conservan el valor escrito y el encabezado de la superficie se actualiza al instante</w:t>
+            </w:r>
+          </w:p>
+        </w:tc>
+        <w:tc>
+          <w:tcPr>
+            <w:tcW w:type="dxa" w:w="3265"/>
+            <w:tcBorders>
+              <w:top w:val="single" w:color="BFC5CC" w:sz="4"/>
+              <w:left w:val="single" w:color="BFC5CC" w:sz="4"/>
+              <w:bottom w:val="single" w:color="BFC5CC" w:sz="4"/>
+              <w:right w:val="single" w:color="BFC5CC" w:sz="4"/>
+            </w:tcBorders>
+            <w:tcMar>
+              <w:top w:type="dxa" w:w="60"/>
+              <w:left w:type="dxa" w:w="100"/>
+              <w:bottom w:type="dxa" w:w="60"/>
+              <w:right w:type="dxa" w:w="100"/>
+            </w:tcMar>
+          </w:tcPr>
+          <w:p>
+            <w:r>
+              <w:rPr>
+                <w:rFonts w:ascii="Calibri" w:cs="Calibri" w:eastAsia="Calibri" w:hAnsi="Calibri"/>
+                <w:sz w:val="20"/>
+                <w:szCs w:val="20"/>
+              </w:rPr>
+              <w:t xml:space="preserve">El campo se recreaba al editar: el valor tardaba en aparecer o volvía al anterior, y el encabezado mostraba el valor previo</w:t>
             </w:r>
           </w:p>
         </w:tc>
@@ -5874,7 +6050,7 @@
         <w:rPr>
           <w:rFonts w:ascii="Calibri" w:cs="Calibri" w:eastAsia="Calibri" w:hAnsi="Calibri"/>
         </w:rPr>
-        <w:t xml:space="preserve"> cada superficie usa su N serie × N paralelo del paso 3. Si faltan, usa el N serie de Dimensionamiento y estima el paralelo por área, con aviso. La tabla muestra </w:t>
+        <w:t xml:space="preserve"> cada superficie usa su N serie × N paralelo del paso 3. Si faltan, usa el N serie de Dimensionamiento y estima el paralelo por área, con aviso. Los strings se muestran siempre como «8 serie × 17 paralelo». La tabla muestra </w:t>
       </w:r>
       <w:r>
         <w:rPr>

</xml_diff>

<commit_message>
Vista 3D: el mapa de calor indica de dónde salen sus valores
Sin POA vigente de la superficie, el mapa de calor de Trayectoria Solar
coloreaba en silencio con la POA general de Recurso Solar (orientación del
proyecto), o con 300 W/m² fijos si no había ninguna POA, bajo el título de
la superficie. Ahora muestra una nota con la POA vigente de la superficie o
un aviso con el motivo y la fuente usada. Manual, Word, Asistente y Spec
de vigencia actualizados.

Co-Authored-By: Claude Opus 5.5 <noreply@anthropic.com>
Claude-Session: https://claude.ai/code/session_01J652KVwAx7nCc91Dn42CnM
</commit_message>
<xml_diff>
--- a/entregables/MANUAL_VISTA_3D_BIPV.docx
+++ b/entregables/MANUAL_VISTA_3D_BIPV.docx
@@ -6388,7 +6388,36 @@
         <w:rPr>
           <w:rFonts w:ascii="Calibri" w:cs="Calibri" w:eastAsia="Calibri" w:hAnsi="Calibri"/>
         </w:rPr>
-        <w:t xml:space="preserve"> (sol detrás del plano, AOI ≥ 90°) o nocturna. Si la superficie tiene POA </w:t>
+        <w:t xml:space="preserve"> (sol detrás del plano, AOI ≥ 90°) o nocturna. Las horas productivas siempre son las de la superficie elegida; los </w:t>
+      </w:r>
+      <w:r>
+        <w:rPr>
+          <w:rFonts w:ascii="Calibri" w:cs="Calibri" w:eastAsia="Calibri" w:hAnsi="Calibri"/>
+          <w:b/>
+          <w:bCs/>
+        </w:rPr>
+        <w:t xml:space="preserve">colores</w:t>
+      </w:r>
+      <w:r>
+        <w:rPr>
+          <w:rFonts w:ascii="Calibri" w:cs="Calibri" w:eastAsia="Calibri" w:hAnsi="Calibri"/>
+        </w:rPr>
+        <w:t xml:space="preserve"> dicen de dónde salen:</w:t>
+      </w:r>
+    </w:p>
+    <w:p>
+      <w:pPr>
+        <w:pStyle w:val="ListParagraph"/>
+        <w:numPr>
+          <w:ilvl w:val="1"/>
+          <w:numId w:val="3"/>
+        </w:numPr>
+      </w:pPr>
+      <w:r>
+        <w:rPr>
+          <w:rFonts w:ascii="Calibri" w:cs="Calibri" w:eastAsia="Calibri" w:hAnsi="Calibri"/>
+        </w:rPr>
+        <w:t xml:space="preserve">con POA </w:t>
       </w:r>
       <w:r>
         <w:rPr>
@@ -6402,7 +6431,51 @@
         <w:rPr>
           <w:rFonts w:ascii="Calibri" w:cs="Calibri" w:eastAsia="Calibri" w:hAnsi="Calibri"/>
         </w:rPr>
-        <w:t xml:space="preserve">, el mapa usa su POA; si no, usa la POA general de ☀️ Recurso Solar. </w:t>
+        <w:t xml:space="preserve"> de la superficie: nota «Valores: POA vigente de esta superficie»;</w:t>
+      </w:r>
+    </w:p>
+    <w:p>
+      <w:pPr>
+        <w:pStyle w:val="ListParagraph"/>
+        <w:numPr>
+          <w:ilvl w:val="1"/>
+          <w:numId w:val="3"/>
+        </w:numPr>
+      </w:pPr>
+      <w:r>
+        <w:rPr>
+          <w:rFonts w:ascii="Calibri" w:cs="Calibri" w:eastAsia="Calibri" w:hAnsi="Calibri"/>
+        </w:rPr>
+        <w:t xml:space="preserve">sin POA vigente: aviso ⚠️ con el motivo, y los colores usan la POA general de ☀️ Recurso Solar (orientación del proyecto);</w:t>
+      </w:r>
+    </w:p>
+    <w:p>
+      <w:pPr>
+        <w:pStyle w:val="ListParagraph"/>
+        <w:numPr>
+          <w:ilvl w:val="1"/>
+          <w:numId w:val="3"/>
+        </w:numPr>
+      </w:pPr>
+      <w:r>
+        <w:rPr>
+          <w:rFonts w:ascii="Calibri" w:cs="Calibri" w:eastAsia="Calibri" w:hAnsi="Calibri"/>
+        </w:rPr>
+        <w:t xml:space="preserve">sin ninguna POA: aviso ⚠️ de estimación fija de 300 W/m². Recalcula con </w:t>
+      </w:r>
+      <w:r>
+        <w:rPr>
+          <w:rFonts w:ascii="Calibri" w:cs="Calibri" w:eastAsia="Calibri" w:hAnsi="Calibri"/>
+          <w:b/>
+          <w:bCs/>
+        </w:rPr>
+        <w:t xml:space="preserve">⚡ Calcular POA</w:t>
+      </w:r>
+      <w:r>
+        <w:rPr>
+          <w:rFonts w:ascii="Calibri" w:cs="Calibri" w:eastAsia="Calibri" w:hAnsi="Calibri"/>
+        </w:rPr>
+        <w:t xml:space="preserve"> para ver la POA real de la superficie. </w:t>
       </w:r>
       <w:r>
         <w:rPr>

</xml_diff>